<commit_message>
Ajuste formato Guia Estudiante 1.5
</commit_message>
<xml_diff>
--- a/Fase 1/Evidencias Grupales/1.5_GuiaEstudiante_Fase 1_Definicion Proyecto APT.docx
+++ b/Fase 1/Evidencias Grupales/1.5_GuiaEstudiante_Fase 1_Definicion Proyecto APT.docx
@@ -2,18 +2,44 @@
 <file path=word/document.xml><?xml version="1.0" encoding="utf-8"?>
 <w:document xmlns:wpc="http://schemas.microsoft.com/office/word/2010/wordprocessingCanvas" xmlns:cx="http://schemas.microsoft.com/office/drawing/2014/chartex" xmlns:cx1="http://schemas.microsoft.com/office/drawing/2015/9/8/chartex" xmlns:cx2="http://schemas.microsoft.com/office/drawing/2015/10/21/chartex" xmlns:cx3="http://schemas.microsoft.com/office/drawing/2016/5/9/chartex" xmlns:cx4="http://schemas.microsoft.com/office/drawing/2016/5/10/chartex" xmlns:cx5="http://schemas.microsoft.com/office/drawing/2016/5/11/chartex" xmlns:cx6="http://schemas.microsoft.com/office/drawing/2016/5/12/chartex" xmlns:cx7="http://schemas.microsoft.com/office/drawing/2016/5/13/chartex" xmlns:cx8="http://schemas.microsoft.com/office/drawing/2016/5/14/chartex" xmlns:mc="http://schemas.openxmlformats.org/markup-compatibility/2006" xmlns:aink="http://schemas.microsoft.com/office/drawing/2016/ink" xmlns:am3d="http://schemas.microsoft.com/office/drawing/2017/model3d" xmlns:o="urn:schemas-microsoft-com:office:office" xmlns:oel="http://schemas.microsoft.com/office/2019/extlst" xmlns:r="http://schemas.openxmlformats.org/officeDocument/2006/relationships" xmlns:m="http://schemas.openxmlformats.org/officeDocument/2006/math" xmlns:v="urn:schemas-microsoft-com:vml" xmlns:wp14="http://schemas.microsoft.com/office/word/2010/wordprocessingDrawing" xmlns:wp="http://schemas.openxmlformats.org/drawingml/2006/wordprocessingDrawing" xmlns:w10="urn:schemas-microsoft-com:office:word" xmlns:w="http://schemas.openxmlformats.org/wordprocessingml/2006/main" xmlns:w14="http://schemas.microsoft.com/office/word/2010/wordml" xmlns:w15="http://schemas.microsoft.com/office/word/2012/wordml" xmlns:w16cex="http://schemas.microsoft.com/office/word/2018/wordml/cex" xmlns:w16cid="http://schemas.microsoft.com/office/word/2016/wordml/cid" xmlns:w16="http://schemas.microsoft.com/office/word/2018/wordml" xmlns:w16du="http://schemas.microsoft.com/office/word/2023/wordml/word16du" xmlns:w16sdtdh="http://schemas.microsoft.com/office/word/2020/wordml/sdtdatahash" xmlns:w16sdtfl="http://schemas.microsoft.com/office/word/2024/wordml/sdtformatlock" xmlns:w16se="http://schemas.microsoft.com/office/word/2015/wordml/symex" xmlns:wpg="http://schemas.microsoft.com/office/word/2010/wordprocessingGroup" xmlns:wpi="http://schemas.microsoft.com/office/word/2010/wordprocessingInk" xmlns:wne="http://schemas.microsoft.com/office/word/2006/wordml" xmlns:wps="http://schemas.microsoft.com/office/word/2010/wordprocessingShape" mc:Ignorable="w14 w15 w16se w16cid w16 w16cex w16sdtdh w16sdtfl w16du wp14">
   <w:body>
+    <w:p/>
+    <w:p/>
+    <w:p/>
+    <w:p/>
     <w:p>
       <w:pPr>
-        <w:pStyle w:val="Ttulo1"/>
         <w:rPr>
           <w:color w:val="1A365D"/>
         </w:rPr>
       </w:pPr>
-      <w:r>
+    </w:p>
+    <w:p/>
+    <w:p/>
+    <w:p/>
+    <w:p/>
+    <w:p/>
+    <w:p/>
+    <w:p/>
+    <w:p/>
+    <w:p/>
+    <w:p/>
+    <w:p/>
+    <w:p/>
+    <w:p/>
+    <w:p/>
+    <w:p>
+      <w:pPr>
+        <w:pStyle w:val="Ttulo1"/>
+        <w:jc w:val="center"/>
         <w:rPr>
           <w:color w:val="1A365D"/>
         </w:rPr>
-        <w:t xml:space="preserve">Guía 1: Definición Proyecto APT — Asignatura </w:t>
+      </w:pPr>
+      <w:r>
+        <w:rPr>
+          <w:color w:val="1A365D"/>
+        </w:rPr>
+        <w:t xml:space="preserve">Guía 1: Definición Proyecto APT  Asignatura </w:t>
       </w:r>
       <w:proofErr w:type="spellStart"/>
       <w:r>
@@ -40,8 +66,11 @@
           <w:between w:val="nil"/>
         </w:pBdr>
         <w:spacing w:line="300" w:lineRule="auto"/>
+        <w:jc w:val="center"/>
         <w:rPr>
           <w:color w:val="2D3748"/>
+          <w:sz w:val="28"/>
+          <w:szCs w:val="28"/>
         </w:rPr>
       </w:pPr>
       <w:r>
@@ -49,12 +78,16 @@
           <w:b/>
           <w:bCs/>
           <w:color w:val="2D3748"/>
+          <w:sz w:val="28"/>
+          <w:szCs w:val="28"/>
         </w:rPr>
         <w:t>Proyecto:</w:t>
       </w:r>
       <w:r>
         <w:rPr>
           <w:color w:val="2D3748"/>
+          <w:sz w:val="28"/>
+          <w:szCs w:val="28"/>
         </w:rPr>
         <w:t xml:space="preserve"> ND SALES v2 — </w:t>
       </w:r>
@@ -62,6 +95,8 @@
       <w:r>
         <w:rPr>
           <w:color w:val="2D3748"/>
+          <w:sz w:val="28"/>
+          <w:szCs w:val="28"/>
         </w:rPr>
         <w:t>NoonDalton</w:t>
       </w:r>
@@ -69,6 +104,8 @@
       <w:r>
         <w:rPr>
           <w:color w:val="2D3748"/>
+          <w:sz w:val="28"/>
+          <w:szCs w:val="28"/>
         </w:rPr>
         <w:t xml:space="preserve"> AI Marketing &amp; Sales Suite</w:t>
       </w:r>
@@ -83,8 +120,11 @@
           <w:between w:val="nil"/>
         </w:pBdr>
         <w:spacing w:after="360" w:line="300" w:lineRule="auto"/>
+        <w:jc w:val="center"/>
         <w:rPr>
           <w:color w:val="2D3748"/>
+          <w:sz w:val="28"/>
+          <w:szCs w:val="28"/>
         </w:rPr>
       </w:pPr>
       <w:r>
@@ -92,14 +132,35 @@
           <w:b/>
           <w:bCs/>
           <w:color w:val="2D3748"/>
+          <w:sz w:val="28"/>
+          <w:szCs w:val="28"/>
         </w:rPr>
         <w:t>Carrera:</w:t>
       </w:r>
       <w:r>
         <w:rPr>
           <w:color w:val="2D3748"/>
+          <w:sz w:val="28"/>
+          <w:szCs w:val="28"/>
         </w:rPr>
         <w:t xml:space="preserve"> Ingeniería en Informática</w:t>
+      </w:r>
+    </w:p>
+    <w:p>
+      <w:pPr>
+        <w:rPr>
+          <w:b/>
+          <w:bCs/>
+          <w:color w:val="2B6CB0"/>
+          <w:sz w:val="36"/>
+          <w:szCs w:val="36"/>
+        </w:rPr>
+      </w:pPr>
+      <w:r>
+        <w:rPr>
+          <w:color w:val="2B6CB0"/>
+        </w:rPr>
+        <w:br w:type="page"/>
       </w:r>
     </w:p>
     <w:p>
@@ -114,6 +175,7 @@
         <w:rPr>
           <w:color w:val="2B6CB0"/>
         </w:rPr>
+        <w:lastRenderedPageBreak/>
         <w:t>PARTE I</w:t>
       </w:r>
     </w:p>
@@ -172,6 +234,7 @@
               <w:bottom w:w="150" w:type="dxa"/>
               <w:right w:w="150" w:type="dxa"/>
             </w:tcMar>
+            <w:vAlign w:val="center"/>
           </w:tcPr>
           <w:p>
             <w:pPr>
@@ -183,6 +246,7 @@
                 <w:between w:val="nil"/>
               </w:pBdr>
               <w:spacing w:before="150" w:after="150" w:line="300" w:lineRule="auto"/>
+              <w:jc w:val="center"/>
               <w:rPr>
                 <w:b/>
                 <w:bCs/>
@@ -219,6 +283,7 @@
               <w:bottom w:w="150" w:type="dxa"/>
               <w:right w:w="150" w:type="dxa"/>
             </w:tcMar>
+            <w:vAlign w:val="center"/>
           </w:tcPr>
           <w:p>
             <w:pPr>
@@ -230,6 +295,7 @@
                 <w:between w:val="nil"/>
               </w:pBdr>
               <w:spacing w:before="150" w:after="150" w:line="300" w:lineRule="auto"/>
+              <w:jc w:val="center"/>
               <w:rPr>
                 <w:b/>
                 <w:bCs/>
@@ -258,18 +324,12 @@
                 <w:right w:val="nil"/>
                 <w:between w:val="nil"/>
               </w:pBdr>
-              <w:rPr>
-                <w:sz w:val="18"/>
-                <w:szCs w:val="18"/>
-              </w:rPr>
-            </w:pPr>
-            <w:r>
-              <w:rPr>
-                <w:sz w:val="18"/>
-                <w:szCs w:val="18"/>
-              </w:rPr>
-              <w:t xml:space="preserve"> </w:t>
-            </w:r>
+              <w:jc w:val="center"/>
+              <w:rPr>
+                <w:sz w:val="18"/>
+                <w:szCs w:val="18"/>
+              </w:rPr>
+            </w:pPr>
           </w:p>
         </w:tc>
       </w:tr>
@@ -289,6 +349,7 @@
               <w:bottom w:w="150" w:type="dxa"/>
               <w:right w:w="150" w:type="dxa"/>
             </w:tcMar>
+            <w:vAlign w:val="center"/>
           </w:tcPr>
           <w:p>
             <w:pPr>
@@ -300,6 +361,7 @@
                 <w:between w:val="nil"/>
               </w:pBdr>
               <w:spacing w:before="150" w:after="150" w:line="300" w:lineRule="auto"/>
+              <w:jc w:val="center"/>
               <w:rPr>
                 <w:b/>
                 <w:bCs/>
@@ -333,6 +395,7 @@
               <w:bottom w:w="150" w:type="dxa"/>
               <w:right w:w="150" w:type="dxa"/>
             </w:tcMar>
+            <w:vAlign w:val="center"/>
           </w:tcPr>
           <w:p>
             <w:pPr>
@@ -344,17 +407,60 @@
                 <w:between w:val="nil"/>
               </w:pBdr>
               <w:spacing w:before="150" w:after="150" w:line="300" w:lineRule="auto"/>
-              <w:rPr>
-                <w:sz w:val="18"/>
-                <w:szCs w:val="18"/>
-              </w:rPr>
-            </w:pPr>
-            <w:r>
-              <w:rPr>
-                <w:sz w:val="18"/>
-                <w:szCs w:val="18"/>
-              </w:rPr>
-              <w:t>Jorge Saavedra, Hernán López, Bárbara Zúñiga, Pablo Gutiérrez</w:t>
+              <w:jc w:val="center"/>
+              <w:rPr>
+                <w:sz w:val="18"/>
+                <w:szCs w:val="18"/>
+              </w:rPr>
+            </w:pPr>
+            <w:r>
+              <w:rPr>
+                <w:sz w:val="18"/>
+                <w:szCs w:val="18"/>
+              </w:rPr>
+              <w:t xml:space="preserve">Jorge Saavedra </w:t>
+            </w:r>
+            <w:r>
+              <w:rPr>
+                <w:sz w:val="18"/>
+                <w:szCs w:val="18"/>
+              </w:rPr>
+              <w:br/>
+            </w:r>
+            <w:r>
+              <w:rPr>
+                <w:sz w:val="18"/>
+                <w:szCs w:val="18"/>
+              </w:rPr>
+              <w:t>Hernán López</w:t>
+            </w:r>
+            <w:r>
+              <w:rPr>
+                <w:sz w:val="18"/>
+                <w:szCs w:val="18"/>
+              </w:rPr>
+              <w:br/>
+            </w:r>
+            <w:r>
+              <w:rPr>
+                <w:sz w:val="18"/>
+                <w:szCs w:val="18"/>
+              </w:rPr>
+              <w:t xml:space="preserve">Bárbara Zúñiga </w:t>
+            </w:r>
+            <w:r>
+              <w:rPr>
+                <w:sz w:val="18"/>
+                <w:szCs w:val="18"/>
+              </w:rPr>
+              <w:br/>
+            </w:r>
+            <w:r>
+              <w:rPr>
+                <w:sz w:val="18"/>
+                <w:szCs w:val="18"/>
+              </w:rPr>
+              <w:t>Pablo Gutiérrez</w:t>
             </w:r>
           </w:p>
         </w:tc>
@@ -376,6 +482,7 @@
               <w:bottom w:w="150" w:type="dxa"/>
               <w:right w:w="150" w:type="dxa"/>
             </w:tcMar>
+            <w:vAlign w:val="center"/>
           </w:tcPr>
           <w:p>
             <w:pPr>
@@ -387,6 +494,7 @@
                 <w:between w:val="nil"/>
               </w:pBdr>
               <w:spacing w:before="150" w:after="150" w:line="300" w:lineRule="auto"/>
+              <w:jc w:val="center"/>
               <w:rPr>
                 <w:b/>
                 <w:bCs/>
@@ -421,6 +529,7 @@
               <w:bottom w:w="150" w:type="dxa"/>
               <w:right w:w="150" w:type="dxa"/>
             </w:tcMar>
+            <w:vAlign w:val="center"/>
           </w:tcPr>
           <w:p>
             <w:pPr>
@@ -432,17 +541,60 @@
                 <w:between w:val="nil"/>
               </w:pBdr>
               <w:spacing w:before="150" w:after="150" w:line="300" w:lineRule="auto"/>
-              <w:rPr>
-                <w:sz w:val="18"/>
-                <w:szCs w:val="18"/>
-              </w:rPr>
-            </w:pPr>
-            <w:r>
-              <w:rPr>
-                <w:sz w:val="18"/>
-                <w:szCs w:val="18"/>
-              </w:rPr>
-              <w:t>20.972.561-4, 18.200.579-7, 15.993.418-7,15.467.017-3</w:t>
+              <w:jc w:val="center"/>
+              <w:rPr>
+                <w:sz w:val="18"/>
+                <w:szCs w:val="18"/>
+              </w:rPr>
+            </w:pPr>
+            <w:r>
+              <w:rPr>
+                <w:sz w:val="18"/>
+                <w:szCs w:val="18"/>
+              </w:rPr>
+              <w:t>20.972.561-4</w:t>
+            </w:r>
+            <w:r>
+              <w:rPr>
+                <w:sz w:val="18"/>
+                <w:szCs w:val="18"/>
+              </w:rPr>
+              <w:br/>
+            </w:r>
+            <w:r>
+              <w:rPr>
+                <w:sz w:val="18"/>
+                <w:szCs w:val="18"/>
+              </w:rPr>
+              <w:t>18.200.579-7</w:t>
+            </w:r>
+            <w:r>
+              <w:rPr>
+                <w:sz w:val="18"/>
+                <w:szCs w:val="18"/>
+              </w:rPr>
+              <w:br/>
+            </w:r>
+            <w:r>
+              <w:rPr>
+                <w:sz w:val="18"/>
+                <w:szCs w:val="18"/>
+              </w:rPr>
+              <w:t>15.993.418-7</w:t>
+            </w:r>
+            <w:r>
+              <w:rPr>
+                <w:sz w:val="18"/>
+                <w:szCs w:val="18"/>
+              </w:rPr>
+              <w:br/>
+            </w:r>
+            <w:r>
+              <w:rPr>
+                <w:sz w:val="18"/>
+                <w:szCs w:val="18"/>
+              </w:rPr>
+              <w:t>15.467.017-3</w:t>
             </w:r>
           </w:p>
         </w:tc>
@@ -463,6 +615,7 @@
               <w:bottom w:w="150" w:type="dxa"/>
               <w:right w:w="150" w:type="dxa"/>
             </w:tcMar>
+            <w:vAlign w:val="center"/>
           </w:tcPr>
           <w:p>
             <w:pPr>
@@ -474,6 +627,7 @@
                 <w:between w:val="nil"/>
               </w:pBdr>
               <w:spacing w:before="150" w:after="150" w:line="300" w:lineRule="auto"/>
+              <w:jc w:val="center"/>
               <w:rPr>
                 <w:b/>
                 <w:bCs/>
@@ -507,6 +661,7 @@
               <w:bottom w:w="150" w:type="dxa"/>
               <w:right w:w="150" w:type="dxa"/>
             </w:tcMar>
+            <w:vAlign w:val="center"/>
           </w:tcPr>
           <w:p>
             <w:pPr>
@@ -518,6 +673,7 @@
                 <w:between w:val="nil"/>
               </w:pBdr>
               <w:spacing w:before="150" w:after="150" w:line="300" w:lineRule="auto"/>
+              <w:jc w:val="center"/>
               <w:rPr>
                 <w:sz w:val="18"/>
                 <w:szCs w:val="18"/>
@@ -550,6 +706,7 @@
               <w:bottom w:w="150" w:type="dxa"/>
               <w:right w:w="150" w:type="dxa"/>
             </w:tcMar>
+            <w:vAlign w:val="center"/>
           </w:tcPr>
           <w:p>
             <w:pPr>
@@ -561,6 +718,7 @@
                 <w:between w:val="nil"/>
               </w:pBdr>
               <w:spacing w:before="150" w:after="150" w:line="300" w:lineRule="auto"/>
+              <w:jc w:val="center"/>
               <w:rPr>
                 <w:b/>
                 <w:bCs/>
@@ -595,6 +753,7 @@
               <w:bottom w:w="150" w:type="dxa"/>
               <w:right w:w="150" w:type="dxa"/>
             </w:tcMar>
+            <w:vAlign w:val="center"/>
           </w:tcPr>
           <w:p>
             <w:pPr>
@@ -606,6 +765,7 @@
                 <w:between w:val="nil"/>
               </w:pBdr>
               <w:spacing w:before="150" w:after="150" w:line="300" w:lineRule="auto"/>
+              <w:jc w:val="center"/>
               <w:rPr>
                 <w:sz w:val="18"/>
                 <w:szCs w:val="18"/>
@@ -629,29 +789,17 @@
         </w:tc>
       </w:tr>
     </w:tbl>
-    <w:p>
-      <w:pPr>
-        <w:pStyle w:val="Ttulo3"/>
-        <w:spacing w:before="360"/>
-        <w:rPr>
-          <w:color w:val="2D3748"/>
-        </w:rPr>
-      </w:pPr>
-    </w:p>
+    <w:p/>
     <w:p>
       <w:pPr>
         <w:rPr>
           <w:b/>
           <w:bCs/>
-          <w:color w:val="2D3748"/>
           <w:sz w:val="28"/>
           <w:szCs w:val="28"/>
         </w:rPr>
       </w:pPr>
       <w:r>
-        <w:rPr>
-          <w:color w:val="2D3748"/>
-        </w:rPr>
         <w:br w:type="page"/>
       </w:r>
     </w:p>
@@ -694,6 +842,9 @@
         <w:gridCol w:w="7020"/>
       </w:tblGrid>
       <w:tr>
+        <w:trPr>
+          <w:trHeight w:val="547"/>
+        </w:trPr>
         <w:tc>
           <w:tcPr>
             <w:tcW w:w="2340" w:type="dxa"/>
@@ -720,7 +871,7 @@
                 <w:right w:val="nil"/>
                 <w:between w:val="nil"/>
               </w:pBdr>
-              <w:spacing w:before="150" w:after="150" w:line="300" w:lineRule="auto"/>
+              <w:spacing w:line="300" w:lineRule="auto"/>
               <w:rPr>
                 <w:b/>
                 <w:bCs/>
@@ -767,7 +918,7 @@
                 <w:right w:val="nil"/>
                 <w:between w:val="nil"/>
               </w:pBdr>
-              <w:spacing w:before="150" w:after="150" w:line="300" w:lineRule="auto"/>
+              <w:spacing w:line="300" w:lineRule="auto"/>
               <w:rPr>
                 <w:b/>
                 <w:bCs/>
@@ -785,28 +936,6 @@
                 <w:szCs w:val="18"/>
               </w:rPr>
               <w:t>Descripción</w:t>
-            </w:r>
-          </w:p>
-          <w:p>
-            <w:pPr>
-              <w:pBdr>
-                <w:top w:val="nil"/>
-                <w:left w:val="nil"/>
-                <w:bottom w:val="nil"/>
-                <w:right w:val="nil"/>
-                <w:between w:val="nil"/>
-              </w:pBdr>
-              <w:rPr>
-                <w:sz w:val="18"/>
-                <w:szCs w:val="18"/>
-              </w:rPr>
-            </w:pPr>
-            <w:r>
-              <w:rPr>
-                <w:sz w:val="18"/>
-                <w:szCs w:val="18"/>
-              </w:rPr>
-              <w:t xml:space="preserve"> </w:t>
             </w:r>
           </w:p>
         </w:tc>
@@ -987,9 +1116,10 @@
           </w:tcPr>
           <w:p>
             <w:pPr>
+              <w:pStyle w:val="Prrafodelista"/>
               <w:numPr>
                 <w:ilvl w:val="0"/>
-                <w:numId w:val="1"/>
+                <w:numId w:val="15"/>
               </w:numPr>
               <w:pBdr>
                 <w:top w:val="nil"/>
@@ -999,6 +1129,7 @@
                 <w:between w:val="nil"/>
               </w:pBdr>
               <w:spacing w:line="300" w:lineRule="auto"/>
+              <w:jc w:val="both"/>
               <w:rPr>
                 <w:sz w:val="18"/>
                 <w:szCs w:val="18"/>
@@ -1103,9 +1234,10 @@
           </w:p>
           <w:p>
             <w:pPr>
+              <w:pStyle w:val="Prrafodelista"/>
               <w:numPr>
                 <w:ilvl w:val="0"/>
-                <w:numId w:val="1"/>
+                <w:numId w:val="15"/>
               </w:numPr>
               <w:pBdr>
                 <w:top w:val="nil"/>
@@ -1115,6 +1247,7 @@
                 <w:between w:val="nil"/>
               </w:pBdr>
               <w:spacing w:line="300" w:lineRule="auto"/>
+              <w:jc w:val="both"/>
               <w:rPr>
                 <w:sz w:val="18"/>
                 <w:szCs w:val="18"/>
@@ -1187,9 +1320,10 @@
           </w:p>
           <w:p>
             <w:pPr>
+              <w:pStyle w:val="Prrafodelista"/>
               <w:numPr>
                 <w:ilvl w:val="0"/>
-                <w:numId w:val="1"/>
+                <w:numId w:val="15"/>
               </w:numPr>
               <w:pBdr>
                 <w:top w:val="nil"/>
@@ -1199,6 +1333,7 @@
                 <w:between w:val="nil"/>
               </w:pBdr>
               <w:spacing w:line="300" w:lineRule="auto"/>
+              <w:jc w:val="both"/>
               <w:rPr>
                 <w:sz w:val="18"/>
                 <w:szCs w:val="18"/>
@@ -1361,9 +1496,10 @@
           </w:p>
           <w:p>
             <w:pPr>
+              <w:pStyle w:val="Prrafodelista"/>
               <w:numPr>
                 <w:ilvl w:val="0"/>
-                <w:numId w:val="2"/>
+                <w:numId w:val="16"/>
               </w:numPr>
               <w:pBdr>
                 <w:top w:val="nil"/>
@@ -1385,15 +1521,13 @@
               </w:rPr>
               <w:t xml:space="preserve">Ofrecer propuestas de solución informática analizando de forma integral los procesos </w:t>
             </w:r>
-            <w:proofErr w:type="gramStart"/>
-            <w:r>
-              <w:rPr>
-                <w:sz w:val="18"/>
-                <w:szCs w:val="18"/>
-              </w:rPr>
-              <w:t>de acuerdo a</w:t>
-            </w:r>
-            <w:proofErr w:type="gramEnd"/>
+            <w:r>
+              <w:rPr>
+                <w:sz w:val="18"/>
+                <w:szCs w:val="18"/>
+              </w:rPr>
+              <w:t>de acuerdo con</w:t>
+            </w:r>
             <w:r>
               <w:rPr>
                 <w:sz w:val="18"/>
@@ -1404,9 +1538,10 @@
           </w:p>
           <w:p>
             <w:pPr>
+              <w:pStyle w:val="Prrafodelista"/>
               <w:numPr>
                 <w:ilvl w:val="0"/>
-                <w:numId w:val="2"/>
+                <w:numId w:val="16"/>
               </w:numPr>
               <w:pBdr>
                 <w:top w:val="nil"/>
@@ -1431,9 +1566,10 @@
           </w:p>
           <w:p>
             <w:pPr>
+              <w:pStyle w:val="Prrafodelista"/>
               <w:numPr>
                 <w:ilvl w:val="0"/>
-                <w:numId w:val="2"/>
+                <w:numId w:val="16"/>
               </w:numPr>
               <w:pBdr>
                 <w:top w:val="nil"/>
@@ -1458,9 +1594,10 @@
           </w:p>
           <w:p>
             <w:pPr>
+              <w:pStyle w:val="Prrafodelista"/>
               <w:numPr>
                 <w:ilvl w:val="0"/>
-                <w:numId w:val="2"/>
+                <w:numId w:val="16"/>
               </w:numPr>
               <w:pBdr>
                 <w:top w:val="nil"/>
@@ -1482,15 +1619,13 @@
               </w:rPr>
               <w:t xml:space="preserve">Implementar soluciones sistémicas integrales para automatizar u optimizar procesos de negocio </w:t>
             </w:r>
-            <w:proofErr w:type="gramStart"/>
-            <w:r>
-              <w:rPr>
-                <w:sz w:val="18"/>
-                <w:szCs w:val="18"/>
-              </w:rPr>
-              <w:t>de acuerdo a</w:t>
-            </w:r>
-            <w:proofErr w:type="gramEnd"/>
+            <w:r>
+              <w:rPr>
+                <w:sz w:val="18"/>
+                <w:szCs w:val="18"/>
+              </w:rPr>
+              <w:t>de acuerdo con</w:t>
+            </w:r>
             <w:r>
               <w:rPr>
                 <w:sz w:val="18"/>
@@ -1501,9 +1636,10 @@
           </w:p>
           <w:p>
             <w:pPr>
+              <w:pStyle w:val="Prrafodelista"/>
               <w:numPr>
                 <w:ilvl w:val="0"/>
-                <w:numId w:val="2"/>
+                <w:numId w:val="16"/>
               </w:numPr>
               <w:pBdr>
                 <w:top w:val="nil"/>
@@ -1525,15 +1661,13 @@
               </w:rPr>
               <w:t xml:space="preserve">Construir el modelo arquitectónico de una solución sistémica que soporte los procesos de negocio </w:t>
             </w:r>
-            <w:proofErr w:type="gramStart"/>
-            <w:r>
-              <w:rPr>
-                <w:sz w:val="18"/>
-                <w:szCs w:val="18"/>
-              </w:rPr>
-              <w:t>de acuerdo a</w:t>
-            </w:r>
-            <w:proofErr w:type="gramEnd"/>
+            <w:r>
+              <w:rPr>
+                <w:sz w:val="18"/>
+                <w:szCs w:val="18"/>
+              </w:rPr>
+              <w:t>de acuerdo con</w:t>
+            </w:r>
             <w:r>
               <w:rPr>
                 <w:sz w:val="18"/>
@@ -1544,9 +1678,10 @@
           </w:p>
           <w:p>
             <w:pPr>
+              <w:pStyle w:val="Prrafodelista"/>
               <w:numPr>
                 <w:ilvl w:val="0"/>
-                <w:numId w:val="2"/>
+                <w:numId w:val="16"/>
               </w:numPr>
               <w:pBdr>
                 <w:top w:val="nil"/>
@@ -1571,9 +1706,10 @@
           </w:p>
           <w:p>
             <w:pPr>
+              <w:pStyle w:val="Prrafodelista"/>
               <w:numPr>
                 <w:ilvl w:val="0"/>
-                <w:numId w:val="2"/>
+                <w:numId w:val="16"/>
               </w:numPr>
               <w:pBdr>
                 <w:top w:val="nil"/>
@@ -1598,9 +1734,10 @@
           </w:p>
           <w:p>
             <w:pPr>
+              <w:pStyle w:val="Prrafodelista"/>
               <w:numPr>
                 <w:ilvl w:val="0"/>
-                <w:numId w:val="2"/>
+                <w:numId w:val="16"/>
               </w:numPr>
               <w:pBdr>
                 <w:top w:val="nil"/>
@@ -1622,15 +1759,13 @@
               </w:rPr>
               <w:t xml:space="preserve">Gestionar proyectos informáticos, ofreciendo alternativas para la toma de decisiones </w:t>
             </w:r>
-            <w:proofErr w:type="gramStart"/>
-            <w:r>
-              <w:rPr>
-                <w:sz w:val="18"/>
-                <w:szCs w:val="18"/>
-              </w:rPr>
-              <w:t>de acuerdo a</w:t>
-            </w:r>
-            <w:proofErr w:type="gramEnd"/>
+            <w:r>
+              <w:rPr>
+                <w:sz w:val="18"/>
+                <w:szCs w:val="18"/>
+              </w:rPr>
+              <w:t>de acuerdo con</w:t>
+            </w:r>
             <w:r>
               <w:rPr>
                 <w:sz w:val="18"/>
@@ -1668,9 +1803,10 @@
           </w:p>
           <w:p>
             <w:pPr>
+              <w:pStyle w:val="Prrafodelista"/>
               <w:numPr>
                 <w:ilvl w:val="0"/>
-                <w:numId w:val="3"/>
+                <w:numId w:val="17"/>
               </w:numPr>
               <w:pBdr>
                 <w:top w:val="nil"/>
@@ -1692,15 +1828,13 @@
               </w:rPr>
               <w:t xml:space="preserve">Elaborar proyectos innovadores que agreguen valor a contextos sociales y productivos, </w:t>
             </w:r>
-            <w:proofErr w:type="gramStart"/>
-            <w:r>
-              <w:rPr>
-                <w:sz w:val="18"/>
-                <w:szCs w:val="18"/>
-              </w:rPr>
-              <w:t>de acuerdo a</w:t>
-            </w:r>
-            <w:proofErr w:type="gramEnd"/>
+            <w:r>
+              <w:rPr>
+                <w:sz w:val="18"/>
+                <w:szCs w:val="18"/>
+              </w:rPr>
+              <w:t>de acuerdo con</w:t>
+            </w:r>
             <w:r>
               <w:rPr>
                 <w:sz w:val="18"/>
@@ -1711,9 +1845,10 @@
           </w:p>
           <w:p>
             <w:pPr>
+              <w:pStyle w:val="Prrafodelista"/>
               <w:numPr>
                 <w:ilvl w:val="0"/>
-                <w:numId w:val="3"/>
+                <w:numId w:val="17"/>
               </w:numPr>
               <w:pBdr>
                 <w:top w:val="nil"/>
@@ -1738,9 +1873,10 @@
           </w:p>
           <w:p>
             <w:pPr>
+              <w:pStyle w:val="Prrafodelista"/>
               <w:numPr>
                 <w:ilvl w:val="0"/>
-                <w:numId w:val="3"/>
+                <w:numId w:val="17"/>
               </w:numPr>
               <w:pBdr>
                 <w:top w:val="nil"/>
@@ -1760,7 +1896,6 @@
                 <w:sz w:val="18"/>
                 <w:szCs w:val="18"/>
               </w:rPr>
-              <w:lastRenderedPageBreak/>
               <w:t>Reconocer un desempeño correcto en situaciones de la profesión o especialidad en el área de la informática.</w:t>
             </w:r>
           </w:p>
@@ -1780,40 +1915,30 @@
           <w:color w:val="2D3748"/>
         </w:rPr>
         <w:lastRenderedPageBreak/>
-        <w:br w:type="textWrapping" w:clear="all"/>
+        <w:t>3. Fundamentación Proyecto APT</w:t>
       </w:r>
     </w:p>
     <w:p>
       <w:pPr>
+        <w:pBdr>
+          <w:top w:val="nil"/>
+          <w:left w:val="nil"/>
+          <w:bottom w:val="nil"/>
+          <w:right w:val="nil"/>
+          <w:between w:val="nil"/>
+        </w:pBdr>
+        <w:spacing w:after="240" w:line="300" w:lineRule="auto"/>
         <w:rPr>
           <w:b/>
           <w:bCs/>
-          <w:color w:val="2D3748"/>
-          <w:sz w:val="28"/>
-          <w:szCs w:val="28"/>
         </w:rPr>
       </w:pPr>
       <w:r>
         <w:rPr>
-          <w:color w:val="2D3748"/>
+          <w:b/>
+          <w:bCs/>
         </w:rPr>
-        <w:br w:type="page"/>
-      </w:r>
-    </w:p>
-    <w:p>
-      <w:pPr>
-        <w:pStyle w:val="Ttulo3"/>
-        <w:spacing w:before="360"/>
-        <w:rPr>
-          <w:color w:val="2D3748"/>
-        </w:rPr>
-      </w:pPr>
-      <w:r>
-        <w:rPr>
-          <w:color w:val="2D3748"/>
-        </w:rPr>
-        <w:lastRenderedPageBreak/>
-        <w:t>3. Fundamentación Proyecto APT</w:t>
+        <w:t>Relevancia del proyecto APT</w:t>
       </w:r>
     </w:p>
     <w:p>
@@ -1826,6 +1951,49 @@
           <w:between w:val="nil"/>
         </w:pBdr>
         <w:spacing w:line="300" w:lineRule="auto"/>
+        <w:jc w:val="both"/>
+      </w:pPr>
+      <w:r>
+        <w:t xml:space="preserve">En las ventas B2B actuales, la lentitud en la prospección, la falta de personalización a escala y la elaboración manual de propuestas comerciales generan cuellos de botella que reducen drásticamente la tasa de cierre. El proyecto se enmarca bajo la modalidad de continuidad sobre la plataforma SaaS </w:t>
+      </w:r>
+      <w:proofErr w:type="spellStart"/>
+      <w:r>
+        <w:rPr>
+          <w:i/>
+          <w:iCs/>
+        </w:rPr>
+        <w:t>NoonDalton</w:t>
+      </w:r>
+      <w:proofErr w:type="spellEnd"/>
+      <w:r>
+        <w:rPr>
+          <w:i/>
+          <w:iCs/>
+        </w:rPr>
+        <w:t xml:space="preserve"> AI Marketing Suite</w:t>
+      </w:r>
+      <w:r>
+        <w:t xml:space="preserve">, entregada por la empresa </w:t>
+      </w:r>
+      <w:proofErr w:type="spellStart"/>
+      <w:r>
+        <w:t>Alloxentric</w:t>
+      </w:r>
+      <w:proofErr w:type="spellEnd"/>
+      <w:r>
+        <w:t>, la cual ya cuenta con una versión 1 aceptada y en producción. Este desarrollo v2 impacta directamente a ejecutivos comerciales y directores de ventas, automatizando tareas críticas mediante agentes de IA y generación de propuestas basadas en datos históricos para acelerar el ciclo comercial.</w:t>
+      </w:r>
+    </w:p>
+    <w:p>
+      <w:pPr>
+        <w:pBdr>
+          <w:top w:val="nil"/>
+          <w:left w:val="nil"/>
+          <w:bottom w:val="nil"/>
+          <w:right w:val="nil"/>
+          <w:between w:val="nil"/>
+        </w:pBdr>
+        <w:spacing w:before="240" w:after="240" w:line="300" w:lineRule="auto"/>
         <w:rPr>
           <w:b/>
           <w:bCs/>
@@ -1836,7 +2004,7 @@
           <w:b/>
           <w:bCs/>
         </w:rPr>
-        <w:t>Relevancia del proyecto APT:</w:t>
+        <w:t>Descripción del Proyecto APT</w:t>
       </w:r>
     </w:p>
     <w:p>
@@ -1849,36 +2017,10 @@
           <w:between w:val="nil"/>
         </w:pBdr>
         <w:spacing w:line="300" w:lineRule="auto"/>
-      </w:pPr>
-      <w:r>
-        <w:t xml:space="preserve">En las ventas B2B actuales, la lentitud en la prospección, la falta de personalización a escala y la elaboración manual de propuestas comerciales generan cuellos de botella que reducen drásticamente la tasa de cierre. El proyecto se enmarca bajo la modalidad de continuidad sobre la plataforma SaaS </w:t>
-      </w:r>
-      <w:proofErr w:type="spellStart"/>
-      <w:r>
-        <w:rPr>
-          <w:i/>
-          <w:iCs/>
-        </w:rPr>
-        <w:t>NoonDalton</w:t>
-      </w:r>
-      <w:proofErr w:type="spellEnd"/>
-      <w:r>
-        <w:rPr>
-          <w:i/>
-          <w:iCs/>
-        </w:rPr>
-        <w:t xml:space="preserve"> AI Marketing Suite</w:t>
-      </w:r>
-      <w:r>
-        <w:t xml:space="preserve">, entregada por la empresa </w:t>
-      </w:r>
-      <w:proofErr w:type="spellStart"/>
-      <w:r>
-        <w:t>Alloxentric</w:t>
-      </w:r>
-      <w:proofErr w:type="spellEnd"/>
-      <w:r>
-        <w:t>, la cual ya cuenta con una versión 1 aceptada y en producción. Este desarrollo v2 impacta directamente a ejecutivos comerciales y directores de ventas, automatizando tareas críticas mediante agentes de IA y generación de propuestas basadas en datos históricos para acelerar el ciclo comercial.</w:t>
+        <w:jc w:val="both"/>
+      </w:pPr>
+      <w:r>
+        <w:t>El proyecto se enfoca en el desarrollo integral del Módulo de Ventas (ND SALES v2), abordando aspectos excluidos de la v1 y optimizaciones de plataforma:</w:t>
       </w:r>
     </w:p>
     <w:p>
@@ -1891,39 +2033,15 @@
           <w:between w:val="nil"/>
         </w:pBdr>
         <w:spacing w:line="300" w:lineRule="auto"/>
-        <w:rPr>
-          <w:b/>
-          <w:bCs/>
-        </w:rPr>
-      </w:pPr>
-      <w:r>
-        <w:rPr>
-          <w:b/>
-          <w:bCs/>
-        </w:rPr>
-        <w:t>Descripción del Proyecto APT:</w:t>
-      </w:r>
+        <w:jc w:val="both"/>
+      </w:pPr>
     </w:p>
     <w:p>
       <w:pPr>
-        <w:pBdr>
-          <w:top w:val="nil"/>
-          <w:left w:val="nil"/>
-          <w:bottom w:val="nil"/>
-          <w:right w:val="nil"/>
-          <w:between w:val="nil"/>
-        </w:pBdr>
-        <w:spacing w:line="300" w:lineRule="auto"/>
-      </w:pPr>
-      <w:r>
-        <w:t>El proyecto se enfoca en el desarrollo integral del Módulo de Ventas (ND SALES v2), abordando aspectos excluidos de la v1 y optimizaciones de plataforma:</w:t>
-      </w:r>
-    </w:p>
-    <w:p>
-      <w:pPr>
+        <w:pStyle w:val="Prrafodelista"/>
         <w:numPr>
           <w:ilvl w:val="0"/>
-          <w:numId w:val="4"/>
+          <w:numId w:val="18"/>
         </w:numPr>
         <w:pBdr>
           <w:top w:val="nil"/>
@@ -1933,6 +2051,7 @@
           <w:between w:val="nil"/>
         </w:pBdr>
         <w:spacing w:line="300" w:lineRule="auto"/>
+        <w:jc w:val="both"/>
       </w:pPr>
       <w:r>
         <w:rPr>
@@ -1979,9 +2098,10 @@
     </w:p>
     <w:p>
       <w:pPr>
+        <w:pStyle w:val="Prrafodelista"/>
         <w:numPr>
           <w:ilvl w:val="0"/>
-          <w:numId w:val="4"/>
+          <w:numId w:val="18"/>
         </w:numPr>
         <w:pBdr>
           <w:top w:val="nil"/>
@@ -1991,6 +2111,7 @@
           <w:between w:val="nil"/>
         </w:pBdr>
         <w:spacing w:line="300" w:lineRule="auto"/>
+        <w:jc w:val="both"/>
       </w:pPr>
       <w:r>
         <w:rPr>
@@ -2053,9 +2174,10 @@
     </w:p>
     <w:p>
       <w:pPr>
+        <w:pStyle w:val="Prrafodelista"/>
         <w:numPr>
           <w:ilvl w:val="0"/>
-          <w:numId w:val="4"/>
+          <w:numId w:val="18"/>
         </w:numPr>
         <w:pBdr>
           <w:top w:val="nil"/>
@@ -2065,6 +2187,7 @@
           <w:between w:val="nil"/>
         </w:pBdr>
         <w:spacing w:line="300" w:lineRule="auto"/>
+        <w:jc w:val="both"/>
       </w:pPr>
       <w:r>
         <w:rPr>
@@ -2127,9 +2250,10 @@
     </w:p>
     <w:p>
       <w:pPr>
+        <w:pStyle w:val="Prrafodelista"/>
         <w:numPr>
           <w:ilvl w:val="0"/>
-          <w:numId w:val="4"/>
+          <w:numId w:val="18"/>
         </w:numPr>
         <w:pBdr>
           <w:top w:val="nil"/>
@@ -2139,6 +2263,7 @@
           <w:between w:val="nil"/>
         </w:pBdr>
         <w:spacing w:line="300" w:lineRule="auto"/>
+        <w:jc w:val="both"/>
       </w:pPr>
       <w:r>
         <w:rPr>
@@ -2201,6 +2326,7 @@
     </w:p>
     <w:p>
       <w:pPr>
+        <w:pStyle w:val="Prrafodelista"/>
         <w:pBdr>
           <w:top w:val="nil"/>
           <w:left w:val="nil"/>
@@ -2209,6 +2335,21 @@
           <w:between w:val="nil"/>
         </w:pBdr>
         <w:spacing w:line="300" w:lineRule="auto"/>
+        <w:ind w:left="660"/>
+        <w:jc w:val="both"/>
+      </w:pPr>
+    </w:p>
+    <w:p>
+      <w:pPr>
+        <w:pBdr>
+          <w:top w:val="nil"/>
+          <w:left w:val="nil"/>
+          <w:bottom w:val="nil"/>
+          <w:right w:val="nil"/>
+          <w:between w:val="nil"/>
+        </w:pBdr>
+        <w:spacing w:after="240" w:line="300" w:lineRule="auto"/>
+        <w:jc w:val="both"/>
         <w:rPr>
           <w:b/>
           <w:bCs/>
@@ -2219,7 +2360,7 @@
           <w:b/>
           <w:bCs/>
         </w:rPr>
-        <w:t>Pertinencia del proyecto con el perfil de egreso:</w:t>
+        <w:t>Pertinencia del proyecto con el perfil de egreso</w:t>
       </w:r>
     </w:p>
     <w:p>
@@ -2232,6 +2373,7 @@
           <w:between w:val="nil"/>
         </w:pBdr>
         <w:spacing w:line="300" w:lineRule="auto"/>
+        <w:jc w:val="both"/>
       </w:pPr>
       <w:r>
         <w:t>Permite aplicar directamente las competencias de la carrera de Ingeniería en Informática: análisis de requerimientos del cliente, arquitectura en la nube con microservicios y colas en memoria, buenas prácticas de desarrollo en Python/</w:t>
@@ -2243,6 +2385,30 @@
       <w:proofErr w:type="spellEnd"/>
       <w:r>
         <w:t xml:space="preserve"> y aseguramiento de calidad con pruebas continuas.</w:t>
+      </w:r>
+    </w:p>
+    <w:p>
+      <w:pPr>
+        <w:pBdr>
+          <w:top w:val="nil"/>
+          <w:left w:val="nil"/>
+          <w:bottom w:val="nil"/>
+          <w:right w:val="nil"/>
+          <w:between w:val="nil"/>
+        </w:pBdr>
+        <w:spacing w:before="240" w:after="240" w:line="300" w:lineRule="auto"/>
+        <w:jc w:val="both"/>
+        <w:rPr>
+          <w:b/>
+          <w:bCs/>
+        </w:rPr>
+      </w:pPr>
+      <w:r>
+        <w:rPr>
+          <w:b/>
+          <w:bCs/>
+        </w:rPr>
+        <w:t>Relación con los intereses profesionales</w:t>
       </w:r>
     </w:p>
     <w:p>
@@ -2255,6 +2421,39 @@
           <w:between w:val="nil"/>
         </w:pBdr>
         <w:spacing w:line="300" w:lineRule="auto"/>
+        <w:jc w:val="both"/>
+      </w:pPr>
+      <w:r>
+        <w:t xml:space="preserve">Consolida la experiencia del equipo en arquitecturas </w:t>
+      </w:r>
+      <w:proofErr w:type="spellStart"/>
+      <w:r>
+        <w:t>cloud</w:t>
+      </w:r>
+      <w:proofErr w:type="spellEnd"/>
+      <w:r>
+        <w:t xml:space="preserve"> modernas, desarrollo </w:t>
+      </w:r>
+      <w:proofErr w:type="spellStart"/>
+      <w:r>
+        <w:t>backend</w:t>
+      </w:r>
+      <w:proofErr w:type="spellEnd"/>
+      <w:r>
+        <w:t xml:space="preserve"> asíncrono, orquestación de agentes con Inteligencia Artificial Generativa y gestión ágil orientada al cliente corporativo.</w:t>
+      </w:r>
+    </w:p>
+    <w:p>
+      <w:pPr>
+        <w:pBdr>
+          <w:top w:val="nil"/>
+          <w:left w:val="nil"/>
+          <w:bottom w:val="nil"/>
+          <w:right w:val="nil"/>
+          <w:between w:val="nil"/>
+        </w:pBdr>
+        <w:spacing w:before="240" w:after="240" w:line="300" w:lineRule="auto"/>
+        <w:jc w:val="both"/>
         <w:rPr>
           <w:b/>
           <w:bCs/>
@@ -2265,7 +2464,128 @@
           <w:b/>
           <w:bCs/>
         </w:rPr>
-        <w:t>Relación con los intereses profesionales:</w:t>
+        <w:lastRenderedPageBreak/>
+        <w:t>Factibilidad de desarrollo del Proyecto APT</w:t>
+      </w:r>
+    </w:p>
+    <w:p>
+      <w:pPr>
+        <w:pBdr>
+          <w:top w:val="nil"/>
+          <w:left w:val="nil"/>
+          <w:bottom w:val="nil"/>
+          <w:right w:val="nil"/>
+          <w:between w:val="nil"/>
+        </w:pBdr>
+        <w:spacing w:after="360" w:line="300" w:lineRule="auto"/>
+        <w:jc w:val="both"/>
+      </w:pPr>
+      <w:r>
+        <w:t>Altamente factible al contar con una base v1 funcional en producción (</w:t>
+      </w:r>
+      <w:proofErr w:type="spellStart"/>
+      <w:r>
+        <w:t>Vercel</w:t>
+      </w:r>
+      <w:proofErr w:type="spellEnd"/>
+      <w:r>
+        <w:t xml:space="preserve">, </w:t>
+      </w:r>
+      <w:proofErr w:type="spellStart"/>
+      <w:r>
+        <w:t>Firestore</w:t>
+      </w:r>
+      <w:proofErr w:type="spellEnd"/>
+      <w:r>
+        <w:t xml:space="preserve">, </w:t>
+      </w:r>
+      <w:proofErr w:type="spellStart"/>
+      <w:r>
+        <w:t>FastAPI</w:t>
+      </w:r>
+      <w:proofErr w:type="spellEnd"/>
+      <w:r>
+        <w:t xml:space="preserve">), </w:t>
+      </w:r>
+      <w:proofErr w:type="spellStart"/>
+      <w:r>
+        <w:t>stack</w:t>
+      </w:r>
+      <w:proofErr w:type="spellEnd"/>
+      <w:r>
+        <w:t xml:space="preserve"> </w:t>
+      </w:r>
+      <w:proofErr w:type="spellStart"/>
+      <w:r>
+        <w:t>cloud</w:t>
+      </w:r>
+      <w:proofErr w:type="spellEnd"/>
+      <w:r>
+        <w:t xml:space="preserve"> validado, trabajo distribuido en un equipo de 4 personas y un canal de comunicación directo mediante reuniones semanales de sincronización con la contraparte técnica de </w:t>
+      </w:r>
+      <w:proofErr w:type="spellStart"/>
+      <w:r>
+        <w:t>Alloxentric</w:t>
+      </w:r>
+      <w:proofErr w:type="spellEnd"/>
+      <w:r>
+        <w:t>.</w:t>
+      </w:r>
+    </w:p>
+    <w:p>
+      <w:pPr>
+        <w:pStyle w:val="Ttulo2"/>
+        <w:spacing w:before="0" w:after="240"/>
+        <w:jc w:val="both"/>
+        <w:rPr>
+          <w:color w:val="2B6CB0"/>
+        </w:rPr>
+      </w:pPr>
+      <w:r>
+        <w:rPr>
+          <w:color w:val="2B6CB0"/>
+        </w:rPr>
+        <w:t>PARTE II</w:t>
+      </w:r>
+    </w:p>
+    <w:p>
+      <w:pPr>
+        <w:pStyle w:val="Ttulo3"/>
+        <w:spacing w:before="0"/>
+        <w:jc w:val="both"/>
+        <w:rPr>
+          <w:color w:val="2D3748"/>
+        </w:rPr>
+      </w:pPr>
+      <w:r>
+        <w:rPr>
+          <w:color w:val="2D3748"/>
+        </w:rPr>
+        <w:t>4. Objetivos</w:t>
+      </w:r>
+    </w:p>
+    <w:p>
+      <w:pPr>
+        <w:pBdr>
+          <w:top w:val="nil"/>
+          <w:left w:val="nil"/>
+          <w:bottom w:val="nil"/>
+          <w:right w:val="nil"/>
+          <w:between w:val="nil"/>
+        </w:pBdr>
+        <w:spacing w:after="240" w:line="300" w:lineRule="auto"/>
+        <w:jc w:val="both"/>
+        <w:rPr>
+          <w:b/>
+          <w:bCs/>
+        </w:rPr>
+      </w:pPr>
+      <w:r>
+        <w:rPr>
+          <w:b/>
+          <w:bCs/>
+        </w:rPr>
+        <w:t>Objetivo General</w:t>
       </w:r>
     </w:p>
     <w:p>
@@ -2278,25 +2598,50 @@
           <w:between w:val="nil"/>
         </w:pBdr>
         <w:spacing w:line="300" w:lineRule="auto"/>
-      </w:pPr>
-      <w:r>
-        <w:t xml:space="preserve">Consolida la experiencia del equipo en arquitecturas </w:t>
+        <w:jc w:val="both"/>
+      </w:pPr>
+      <w:r>
+        <w:t xml:space="preserve">Desarrollar e implementar el módulo de ventas (ND SALES v2) para la plataforma SaaS </w:t>
       </w:r>
       <w:proofErr w:type="spellStart"/>
       <w:r>
-        <w:t>cloud</w:t>
+        <w:t>NoonDalton</w:t>
       </w:r>
       <w:proofErr w:type="spellEnd"/>
       <w:r>
-        <w:t xml:space="preserve"> modernas, desarrollo </w:t>
+        <w:t xml:space="preserve"> AI Marketing Suite mediante la metodología Kanban, incorporando generación de propuestas comerciales asistidas por RAG, prospección </w:t>
       </w:r>
       <w:proofErr w:type="spellStart"/>
       <w:r>
-        <w:t>backend</w:t>
+        <w:t>multiagente</w:t>
       </w:r>
       <w:proofErr w:type="spellEnd"/>
       <w:r>
-        <w:t xml:space="preserve"> asíncrono, orquestación de agentes con Inteligencia Artificial Generativa y gestión ágil orientada al cliente corporativo.</w:t>
+        <w:t xml:space="preserve">, </w:t>
+      </w:r>
+      <w:proofErr w:type="spellStart"/>
+      <w:r>
+        <w:t>workers</w:t>
+      </w:r>
+      <w:proofErr w:type="spellEnd"/>
+      <w:r>
+        <w:t xml:space="preserve"> asíncronos con </w:t>
+      </w:r>
+      <w:proofErr w:type="spellStart"/>
+      <w:r>
+        <w:t>Celery</w:t>
+      </w:r>
+      <w:proofErr w:type="spellEnd"/>
+      <w:r>
+        <w:t xml:space="preserve">/Redis y pruebas automatizadas bajo validación semanal continua con la empresa </w:t>
+      </w:r>
+      <w:proofErr w:type="spellStart"/>
+      <w:r>
+        <w:t>Alloxentric</w:t>
+      </w:r>
+      <w:proofErr w:type="spellEnd"/>
+      <w:r>
+        <w:t>.</w:t>
       </w:r>
     </w:p>
     <w:p>
@@ -2309,18 +2654,8 @@
           <w:between w:val="nil"/>
         </w:pBdr>
         <w:spacing w:line="300" w:lineRule="auto"/>
-        <w:rPr>
-          <w:b/>
-          <w:bCs/>
-        </w:rPr>
-      </w:pPr>
-      <w:r>
-        <w:rPr>
-          <w:b/>
-          <w:bCs/>
-        </w:rPr>
-        <w:t>Factibilidad de desarrollo del Proyecto APT:</w:t>
-      </w:r>
+        <w:jc w:val="both"/>
+      </w:pPr>
     </w:p>
     <w:p>
       <w:pPr>
@@ -2331,101 +2666,8 @@
           <w:right w:val="nil"/>
           <w:between w:val="nil"/>
         </w:pBdr>
-        <w:spacing w:after="360" w:line="300" w:lineRule="auto"/>
-      </w:pPr>
-      <w:r>
-        <w:t>Altamente factible al contar con una base v1 funcional en producción (</w:t>
-      </w:r>
-      <w:proofErr w:type="spellStart"/>
-      <w:r>
-        <w:t>Vercel</w:t>
-      </w:r>
-      <w:proofErr w:type="spellEnd"/>
-      <w:r>
-        <w:t xml:space="preserve">, </w:t>
-      </w:r>
-      <w:proofErr w:type="spellStart"/>
-      <w:r>
-        <w:t>Firestore</w:t>
-      </w:r>
-      <w:proofErr w:type="spellEnd"/>
-      <w:r>
-        <w:t xml:space="preserve">, </w:t>
-      </w:r>
-      <w:proofErr w:type="spellStart"/>
-      <w:r>
-        <w:t>FastAPI</w:t>
-      </w:r>
-      <w:proofErr w:type="spellEnd"/>
-      <w:r>
-        <w:t xml:space="preserve">), </w:t>
-      </w:r>
-      <w:proofErr w:type="spellStart"/>
-      <w:r>
-        <w:t>stack</w:t>
-      </w:r>
-      <w:proofErr w:type="spellEnd"/>
-      <w:r>
-        <w:t xml:space="preserve"> </w:t>
-      </w:r>
-      <w:proofErr w:type="spellStart"/>
-      <w:r>
-        <w:t>cloud</w:t>
-      </w:r>
-      <w:proofErr w:type="spellEnd"/>
-      <w:r>
-        <w:t xml:space="preserve"> validado, trabajo distribuido en un equipo de 4 personas y un canal de comunicación directo mediante reuniones semanales de sincronización con la contraparte técnica de </w:t>
-      </w:r>
-      <w:proofErr w:type="spellStart"/>
-      <w:r>
-        <w:t>Alloxentric</w:t>
-      </w:r>
-      <w:proofErr w:type="spellEnd"/>
-      <w:r>
-        <w:t>.</w:t>
-      </w:r>
-    </w:p>
-    <w:p>
-      <w:pPr>
-        <w:pStyle w:val="Ttulo2"/>
-        <w:spacing w:before="0" w:after="240"/>
-        <w:rPr>
-          <w:color w:val="2B6CB0"/>
-        </w:rPr>
-      </w:pPr>
-      <w:r>
-        <w:rPr>
-          <w:color w:val="2B6CB0"/>
-        </w:rPr>
-        <w:lastRenderedPageBreak/>
-        <w:t>PARTE II</w:t>
-      </w:r>
-    </w:p>
-    <w:p>
-      <w:pPr>
-        <w:pStyle w:val="Ttulo3"/>
-        <w:spacing w:before="0"/>
-        <w:rPr>
-          <w:color w:val="2D3748"/>
-        </w:rPr>
-      </w:pPr>
-      <w:r>
-        <w:rPr>
-          <w:color w:val="2D3748"/>
-        </w:rPr>
-        <w:t>4. Objetivos</w:t>
-      </w:r>
-    </w:p>
-    <w:p>
-      <w:pPr>
-        <w:pBdr>
-          <w:top w:val="nil"/>
-          <w:left w:val="nil"/>
-          <w:bottom w:val="nil"/>
-          <w:right w:val="nil"/>
-          <w:between w:val="nil"/>
-        </w:pBdr>
-        <w:spacing w:line="300" w:lineRule="auto"/>
+        <w:spacing w:after="240" w:line="300" w:lineRule="auto"/>
+        <w:jc w:val="both"/>
         <w:rPr>
           <w:b/>
           <w:bCs/>
@@ -2436,97 +2678,7 @@
           <w:b/>
           <w:bCs/>
         </w:rPr>
-        <w:t>Objetivo General:</w:t>
-      </w:r>
-    </w:p>
-    <w:p>
-      <w:pPr>
-        <w:pBdr>
-          <w:top w:val="nil"/>
-          <w:left w:val="nil"/>
-          <w:bottom w:val="nil"/>
-          <w:right w:val="nil"/>
-          <w:between w:val="nil"/>
-        </w:pBdr>
-        <w:spacing w:line="300" w:lineRule="auto"/>
-      </w:pPr>
-      <w:r>
-        <w:t xml:space="preserve">Desarrollar e implementar el módulo de ventas (ND SALES v2) para la plataforma SaaS </w:t>
-      </w:r>
-      <w:proofErr w:type="spellStart"/>
-      <w:r>
-        <w:t>NoonDalton</w:t>
-      </w:r>
-      <w:proofErr w:type="spellEnd"/>
-      <w:r>
-        <w:t xml:space="preserve"> AI Marketing Suite mediante la metodología Kanban, incorporando generación de propuestas comerciales asistidas por RAG, prospección </w:t>
-      </w:r>
-      <w:proofErr w:type="spellStart"/>
-      <w:r>
-        <w:t>multiagente</w:t>
-      </w:r>
-      <w:proofErr w:type="spellEnd"/>
-      <w:r>
-        <w:t xml:space="preserve">, </w:t>
-      </w:r>
-      <w:proofErr w:type="spellStart"/>
-      <w:r>
-        <w:t>workers</w:t>
-      </w:r>
-      <w:proofErr w:type="spellEnd"/>
-      <w:r>
-        <w:t xml:space="preserve"> asíncronos con </w:t>
-      </w:r>
-      <w:proofErr w:type="spellStart"/>
-      <w:r>
-        <w:t>Celery</w:t>
-      </w:r>
-      <w:proofErr w:type="spellEnd"/>
-      <w:r>
-        <w:t xml:space="preserve">/Redis y pruebas automatizadas bajo validación semanal continua con la empresa </w:t>
-      </w:r>
-      <w:proofErr w:type="spellStart"/>
-      <w:r>
-        <w:t>Alloxentric</w:t>
-      </w:r>
-      <w:proofErr w:type="spellEnd"/>
-      <w:r>
-        <w:t>.</w:t>
-      </w:r>
-    </w:p>
-    <w:p>
-      <w:pPr>
-        <w:pBdr>
-          <w:top w:val="nil"/>
-          <w:left w:val="nil"/>
-          <w:bottom w:val="nil"/>
-          <w:right w:val="nil"/>
-          <w:between w:val="nil"/>
-        </w:pBdr>
-        <w:spacing w:line="300" w:lineRule="auto"/>
-      </w:pPr>
-    </w:p>
-    <w:p>
-      <w:pPr>
-        <w:pBdr>
-          <w:top w:val="nil"/>
-          <w:left w:val="nil"/>
-          <w:bottom w:val="nil"/>
-          <w:right w:val="nil"/>
-          <w:between w:val="nil"/>
-        </w:pBdr>
-        <w:spacing w:line="300" w:lineRule="auto"/>
-        <w:rPr>
-          <w:b/>
-          <w:bCs/>
-        </w:rPr>
-      </w:pPr>
-      <w:r>
-        <w:rPr>
-          <w:b/>
-          <w:bCs/>
-        </w:rPr>
-        <w:t>Objetivos Específicos:</w:t>
+        <w:t>Objetivos Específicos</w:t>
       </w:r>
     </w:p>
     <w:p>
@@ -2543,6 +2695,7 @@
           <w:between w:val="nil"/>
         </w:pBdr>
         <w:spacing w:line="300" w:lineRule="auto"/>
+        <w:jc w:val="both"/>
       </w:pPr>
       <w:r>
         <w:t>Diseñar e implementar el motor de propuestas comerciales (</w:t>
@@ -2578,6 +2731,7 @@
           <w:between w:val="nil"/>
         </w:pBdr>
         <w:spacing w:line="300" w:lineRule="auto"/>
+        <w:jc w:val="both"/>
       </w:pPr>
       <w:r>
         <w:t xml:space="preserve">Construir el pipeline </w:t>
@@ -2629,6 +2783,7 @@
           <w:between w:val="nil"/>
         </w:pBdr>
         <w:spacing w:line="300" w:lineRule="auto"/>
+        <w:jc w:val="both"/>
       </w:pPr>
       <w:r>
         <w:t>Desarrollar los submódulos de gestión de oportunidades (</w:t>
@@ -2680,6 +2835,7 @@
           <w:between w:val="nil"/>
         </w:pBdr>
         <w:spacing w:line="300" w:lineRule="auto"/>
+        <w:jc w:val="both"/>
       </w:pPr>
       <w:r>
         <w:t xml:space="preserve">Implementar la arquitectura de procesamiento asíncrono basada en </w:t>
@@ -2707,6 +2863,7 @@
           <w:between w:val="nil"/>
         </w:pBdr>
         <w:spacing w:line="300" w:lineRule="auto"/>
+        <w:jc w:val="both"/>
       </w:pPr>
       <w:r>
         <w:t xml:space="preserve">Implementar la suite de pruebas automatizadas con </w:t>
@@ -2738,6 +2895,7 @@
     </w:p>
     <w:p>
       <w:pPr>
+        <w:jc w:val="both"/>
         <w:rPr>
           <w:b/>
           <w:bCs/>
@@ -2757,6 +2915,7 @@
       <w:pPr>
         <w:pStyle w:val="Ttulo3"/>
         <w:spacing w:before="360"/>
+        <w:jc w:val="both"/>
         <w:rPr>
           <w:color w:val="2D3748"/>
         </w:rPr>
@@ -2779,6 +2938,7 @@
           <w:between w:val="nil"/>
         </w:pBdr>
         <w:spacing w:line="300" w:lineRule="auto"/>
+        <w:jc w:val="both"/>
       </w:pPr>
       <w:r>
         <w:t xml:space="preserve">Se aplicará una metodología ágil de </w:t>
@@ -2820,6 +2980,7 @@
           <w:between w:val="nil"/>
         </w:pBdr>
         <w:spacing w:line="300" w:lineRule="auto"/>
+        <w:jc w:val="both"/>
       </w:pPr>
     </w:p>
     <w:p>
@@ -2831,7 +2992,8 @@
           <w:right w:val="nil"/>
           <w:between w:val="nil"/>
         </w:pBdr>
-        <w:spacing w:line="300" w:lineRule="auto"/>
+        <w:spacing w:after="240" w:line="300" w:lineRule="auto"/>
+        <w:jc w:val="both"/>
         <w:rPr>
           <w:b/>
           <w:bCs/>
@@ -2842,14 +3004,15 @@
           <w:b/>
           <w:bCs/>
         </w:rPr>
-        <w:t>Pilares Operativos de Kanban en el Proyecto:</w:t>
+        <w:t>Pilares Operativos de Kanban en el Proyecto</w:t>
       </w:r>
     </w:p>
     <w:p>
       <w:pPr>
+        <w:pStyle w:val="Prrafodelista"/>
         <w:numPr>
           <w:ilvl w:val="0"/>
-          <w:numId w:val="6"/>
+          <w:numId w:val="19"/>
         </w:numPr>
         <w:pBdr>
           <w:top w:val="nil"/>
@@ -2859,6 +3022,7 @@
           <w:between w:val="nil"/>
         </w:pBdr>
         <w:spacing w:line="300" w:lineRule="auto"/>
+        <w:jc w:val="both"/>
       </w:pPr>
       <w:r>
         <w:rPr>
@@ -2868,7 +3032,13 @@
         <w:t>Tablero Visual de Flujo:</w:t>
       </w:r>
       <w:r>
-        <w:t xml:space="preserve"> Gestión de ítems de trabajo en herramientas visuales (Jira / GitHub </w:t>
+        <w:t xml:space="preserve"> Gestión de ítems de trabajo en herramientas visuales (Jira</w:t>
+      </w:r>
+      <w:r>
+        <w:t xml:space="preserve"> o similar</w:t>
+      </w:r>
+      <w:r>
+        <w:t xml:space="preserve"> / GitHub </w:t>
       </w:r>
       <w:proofErr w:type="spellStart"/>
       <w:r>
@@ -2988,9 +3158,10 @@
     </w:p>
     <w:p>
       <w:pPr>
+        <w:pStyle w:val="Prrafodelista"/>
         <w:numPr>
           <w:ilvl w:val="0"/>
-          <w:numId w:val="6"/>
+          <w:numId w:val="19"/>
         </w:numPr>
         <w:pBdr>
           <w:top w:val="nil"/>
@@ -3000,6 +3171,7 @@
           <w:between w:val="nil"/>
         </w:pBdr>
         <w:spacing w:line="300" w:lineRule="auto"/>
+        <w:jc w:val="both"/>
       </w:pPr>
       <w:r>
         <w:rPr>
@@ -3030,9 +3202,10 @@
     </w:p>
     <w:p>
       <w:pPr>
+        <w:pStyle w:val="Prrafodelista"/>
         <w:numPr>
           <w:ilvl w:val="0"/>
-          <w:numId w:val="6"/>
+          <w:numId w:val="19"/>
         </w:numPr>
         <w:pBdr>
           <w:top w:val="nil"/>
@@ -3042,6 +3215,7 @@
           <w:between w:val="nil"/>
         </w:pBdr>
         <w:spacing w:line="300" w:lineRule="auto"/>
+        <w:jc w:val="both"/>
       </w:pPr>
       <w:r>
         <w:rPr>
@@ -3081,7 +3255,48 @@
         </w:pBdr>
         <w:spacing w:line="300" w:lineRule="auto"/>
         <w:ind w:left="300"/>
-      </w:pPr>
+        <w:jc w:val="both"/>
+      </w:pPr>
+    </w:p>
+    <w:p>
+      <w:pPr>
+        <w:pBdr>
+          <w:top w:val="nil"/>
+          <w:left w:val="nil"/>
+          <w:bottom w:val="nil"/>
+          <w:right w:val="nil"/>
+          <w:between w:val="nil"/>
+        </w:pBdr>
+        <w:spacing w:after="240" w:line="300" w:lineRule="auto"/>
+        <w:jc w:val="both"/>
+        <w:rPr>
+          <w:b/>
+          <w:bCs/>
+        </w:rPr>
+      </w:pPr>
+      <w:r>
+        <w:rPr>
+          <w:b/>
+          <w:bCs/>
+        </w:rPr>
+        <w:t>Integración con el Cliente (</w:t>
+      </w:r>
+      <w:proofErr w:type="spellStart"/>
+      <w:r>
+        <w:rPr>
+          <w:b/>
+          <w:bCs/>
+        </w:rPr>
+        <w:t>Alloxentric</w:t>
+      </w:r>
+      <w:proofErr w:type="spellEnd"/>
+      <w:r>
+        <w:rPr>
+          <w:b/>
+          <w:bCs/>
+        </w:rPr>
+        <w:t>)</w:t>
+      </w:r>
     </w:p>
     <w:p>
       <w:pPr>
@@ -3093,33 +3308,49 @@
           <w:between w:val="nil"/>
         </w:pBdr>
         <w:spacing w:line="300" w:lineRule="auto"/>
+        <w:jc w:val="both"/>
+      </w:pPr>
+      <w:r>
+        <w:t xml:space="preserve">Se establece una </w:t>
+      </w:r>
+      <w:r>
         <w:rPr>
           <w:b/>
           <w:bCs/>
         </w:rPr>
-      </w:pPr>
+        <w:t>Reunión Semanal de Sincronización (</w:t>
+      </w:r>
       <w:r>
         <w:rPr>
           <w:b/>
           <w:bCs/>
         </w:rPr>
-        <w:t>Integración con el Cliente (</w:t>
-      </w:r>
-      <w:proofErr w:type="spellStart"/>
+        <w:t>30</w:t>
+      </w:r>
       <w:r>
         <w:rPr>
           <w:b/>
           <w:bCs/>
         </w:rPr>
-        <w:t>Alloxentric</w:t>
-      </w:r>
-      <w:proofErr w:type="spellEnd"/>
+        <w:t xml:space="preserve"> min)</w:t>
+      </w:r>
       <w:r>
         <w:rPr>
           <w:b/>
           <w:bCs/>
         </w:rPr>
-        <w:t>) — Cadencia Semanal:</w:t>
+        <w:t>,</w:t>
+      </w:r>
+      <w:r>
+        <w:t xml:space="preserve"> con el representante de </w:t>
+      </w:r>
+      <w:proofErr w:type="spellStart"/>
+      <w:r>
+        <w:t>Alloxentric</w:t>
+      </w:r>
+      <w:proofErr w:type="spellEnd"/>
+      <w:r>
+        <w:t>, estructurada formalmente en dos etapas:</w:t>
       </w:r>
     </w:p>
     <w:p>
@@ -3132,28 +3363,8 @@
           <w:between w:val="nil"/>
         </w:pBdr>
         <w:spacing w:line="300" w:lineRule="auto"/>
-      </w:pPr>
-      <w:r>
-        <w:t xml:space="preserve">Se establece una </w:t>
-      </w:r>
-      <w:r>
-        <w:rPr>
-          <w:b/>
-          <w:bCs/>
-        </w:rPr>
-        <w:t>Reunión Semanal de Sincronización (45 min)</w:t>
-      </w:r>
-      <w:r>
-        <w:t xml:space="preserve"> fija con el representante de </w:t>
-      </w:r>
-      <w:proofErr w:type="spellStart"/>
-      <w:r>
-        <w:t>Alloxentric</w:t>
-      </w:r>
-      <w:proofErr w:type="spellEnd"/>
-      <w:r>
-        <w:t>, estructurada formalmente en dos etapas:</w:t>
-      </w:r>
+        <w:jc w:val="both"/>
+      </w:pPr>
     </w:p>
     <w:p>
       <w:pPr>
@@ -3169,6 +3380,7 @@
           <w:between w:val="nil"/>
         </w:pBdr>
         <w:spacing w:line="300" w:lineRule="auto"/>
+        <w:jc w:val="both"/>
       </w:pPr>
       <w:r>
         <w:rPr>
@@ -3191,7 +3403,21 @@
           <w:b/>
           <w:bCs/>
         </w:rPr>
-        <w:t xml:space="preserve"> de Avance (20 min):</w:t>
+        <w:t xml:space="preserve"> de Avance (</w:t>
+      </w:r>
+      <w:r>
+        <w:rPr>
+          <w:b/>
+          <w:bCs/>
+        </w:rPr>
+        <w:t>15</w:t>
+      </w:r>
+      <w:r>
+        <w:rPr>
+          <w:b/>
+          <w:bCs/>
+        </w:rPr>
+        <w:t xml:space="preserve"> min):</w:t>
       </w:r>
       <w:r>
         <w:t xml:space="preserve"> Presentación funcional de las tarjetas finalizadas que llegaron a la columna </w:t>
@@ -3229,6 +3455,7 @@
           <w:between w:val="nil"/>
         </w:pBdr>
         <w:spacing w:line="300" w:lineRule="auto"/>
+        <w:jc w:val="both"/>
       </w:pPr>
       <w:r>
         <w:rPr>
@@ -3251,7 +3478,21 @@
           <w:b/>
           <w:bCs/>
         </w:rPr>
-        <w:t>) (25 min):</w:t>
+        <w:t>) (</w:t>
+      </w:r>
+      <w:r>
+        <w:rPr>
+          <w:b/>
+          <w:bCs/>
+        </w:rPr>
+        <w:t>15</w:t>
+      </w:r>
+      <w:r>
+        <w:rPr>
+          <w:b/>
+          <w:bCs/>
+        </w:rPr>
+        <w:t xml:space="preserve"> min):</w:t>
       </w:r>
       <w:r>
         <w:t xml:space="preserve"> Desbloqueo de dudas de negocio comercial y selección colaborativa de las tarjetas prioritarias del Backlog que ingresarán a la columna de compromiso para la semana siguiente.</w:t>
@@ -3268,10 +3509,12 @@
         </w:pBdr>
         <w:spacing w:line="300" w:lineRule="auto"/>
         <w:ind w:left="300"/>
+        <w:jc w:val="both"/>
       </w:pPr>
     </w:p>
     <w:p>
       <w:pPr>
+        <w:jc w:val="both"/>
         <w:rPr>
           <w:b/>
           <w:bCs/>
@@ -3294,7 +3537,8 @@
           <w:right w:val="nil"/>
           <w:between w:val="nil"/>
         </w:pBdr>
-        <w:spacing w:line="300" w:lineRule="auto"/>
+        <w:spacing w:after="240" w:line="300" w:lineRule="auto"/>
+        <w:jc w:val="both"/>
         <w:rPr>
           <w:b/>
           <w:bCs/>
@@ -3306,10 +3550,13 @@
           <w:bCs/>
         </w:rPr>
         <w:lastRenderedPageBreak/>
-        <w:t>Roles y Responsabilidades del Equipo:</w:t>
+        <w:t>Roles y Responsabilidades del Equipo</w:t>
       </w:r>
     </w:p>
     <w:p>
+      <w:pPr>
+        <w:jc w:val="both"/>
+      </w:pPr>
       <w:r>
         <w:rPr>
           <w:b/>
@@ -3331,10 +3578,17 @@
     </w:p>
     <w:p>
       <w:pPr>
+        <w:jc w:val="both"/>
+      </w:pPr>
+    </w:p>
+    <w:p>
+      <w:pPr>
+        <w:pStyle w:val="Prrafodelista"/>
         <w:numPr>
           <w:ilvl w:val="0"/>
-          <w:numId w:val="9"/>
+          <w:numId w:val="23"/>
         </w:numPr>
+        <w:jc w:val="both"/>
       </w:pPr>
       <w:r>
         <w:t xml:space="preserve">Interés y foco: Lógica de servidor, arquitectura </w:t>
@@ -3350,10 +3604,12 @@
     </w:p>
     <w:p>
       <w:pPr>
+        <w:pStyle w:val="Prrafodelista"/>
         <w:numPr>
           <w:ilvl w:val="0"/>
-          <w:numId w:val="9"/>
+          <w:numId w:val="23"/>
         </w:numPr>
+        <w:jc w:val="both"/>
       </w:pPr>
       <w:r>
         <w:t xml:space="preserve">Responsabilidades: Construcción de los servicios del </w:t>
@@ -3392,23 +3648,62 @@
       </w:r>
     </w:p>
     <w:p>
+      <w:pPr>
+        <w:pStyle w:val="Prrafodelista"/>
+        <w:jc w:val="both"/>
+      </w:pPr>
+    </w:p>
+    <w:p>
+      <w:pPr>
+        <w:jc w:val="both"/>
+      </w:pPr>
       <w:r>
         <w:rPr>
           <w:b/>
           <w:bCs/>
         </w:rPr>
-        <w:t>Hernán López</w:t>
-      </w:r>
+        <w:t xml:space="preserve">Hernán </w:t>
+      </w:r>
+      <w:proofErr w:type="spellStart"/>
+      <w:r>
+        <w:rPr>
+          <w:b/>
+          <w:bCs/>
+        </w:rPr>
+        <w:t>L</w:t>
+      </w:r>
+      <w:r>
+        <w:rPr>
+          <w:b/>
+          <w:bCs/>
+        </w:rPr>
+        <w:t>o</w:t>
+      </w:r>
+      <w:r>
+        <w:rPr>
+          <w:b/>
+          <w:bCs/>
+        </w:rPr>
+        <w:t>pez</w:t>
+      </w:r>
+      <w:proofErr w:type="spellEnd"/>
       <w:r>
         <w:t>: Ingeniero de Datos / Modelo de Datos y Reportería de Pipeline (BI)</w:t>
       </w:r>
     </w:p>
     <w:p>
       <w:pPr>
+        <w:jc w:val="both"/>
+      </w:pPr>
+    </w:p>
+    <w:p>
+      <w:pPr>
+        <w:pStyle w:val="Prrafodelista"/>
         <w:numPr>
           <w:ilvl w:val="0"/>
-          <w:numId w:val="10"/>
+          <w:numId w:val="21"/>
         </w:numPr>
+        <w:jc w:val="both"/>
       </w:pPr>
       <w:r>
         <w:t>Interés y foco: Análisis de datos, arquitectura de datos en la nube e inteligencia de negocios.</w:t>
@@ -3416,10 +3711,12 @@
     </w:p>
     <w:p>
       <w:pPr>
+        <w:pStyle w:val="Prrafodelista"/>
         <w:numPr>
           <w:ilvl w:val="0"/>
-          <w:numId w:val="10"/>
+          <w:numId w:val="21"/>
         </w:numPr>
+        <w:jc w:val="both"/>
       </w:pPr>
       <w:r>
         <w:t xml:space="preserve">Responsabilidades: Diseño y estructuración del modelo de datos no relacional en Google Cloud </w:t>
@@ -3466,6 +3763,15 @@
       </w:r>
     </w:p>
     <w:p>
+      <w:pPr>
+        <w:ind w:left="720"/>
+        <w:jc w:val="both"/>
+      </w:pPr>
+    </w:p>
+    <w:p>
+      <w:pPr>
+        <w:jc w:val="both"/>
+      </w:pPr>
       <w:r>
         <w:rPr>
           <w:b/>
@@ -3487,10 +3793,17 @@
     </w:p>
     <w:p>
       <w:pPr>
+        <w:jc w:val="both"/>
+      </w:pPr>
+    </w:p>
+    <w:p>
+      <w:pPr>
+        <w:pStyle w:val="Prrafodelista"/>
         <w:numPr>
           <w:ilvl w:val="0"/>
-          <w:numId w:val="11"/>
+          <w:numId w:val="22"/>
         </w:numPr>
+        <w:jc w:val="both"/>
       </w:pPr>
       <w:r>
         <w:t>Interés y foco: Construcción de interfaces de usuario orientadas al flujo de trabajo real del vendedor.</w:t>
@@ -3498,10 +3811,12 @@
     </w:p>
     <w:p>
       <w:pPr>
+        <w:pStyle w:val="Prrafodelista"/>
         <w:numPr>
           <w:ilvl w:val="0"/>
-          <w:numId w:val="11"/>
+          <w:numId w:val="22"/>
         </w:numPr>
+        <w:jc w:val="both"/>
       </w:pPr>
       <w:r>
         <w:t xml:space="preserve">Responsabilidades: Implementación del </w:t>
@@ -3540,6 +3855,15 @@
       </w:r>
     </w:p>
     <w:p>
+      <w:pPr>
+        <w:ind w:left="720"/>
+        <w:jc w:val="both"/>
+      </w:pPr>
+    </w:p>
+    <w:p>
+      <w:pPr>
+        <w:jc w:val="both"/>
+      </w:pPr>
       <w:r>
         <w:rPr>
           <w:b/>
@@ -3553,10 +3877,19 @@
     </w:p>
     <w:p>
       <w:pPr>
+        <w:ind w:left="1134"/>
+        <w:jc w:val="both"/>
+      </w:pPr>
+    </w:p>
+    <w:p>
+      <w:pPr>
+        <w:pStyle w:val="Prrafodelista"/>
         <w:numPr>
           <w:ilvl w:val="0"/>
-          <w:numId w:val="12"/>
+          <w:numId w:val="25"/>
         </w:numPr>
+        <w:ind w:left="1134"/>
+        <w:jc w:val="both"/>
       </w:pPr>
       <w:r>
         <w:t xml:space="preserve">Interés y foco: Calidad del software, disciplina de </w:t>
@@ -3572,10 +3905,13 @@
     </w:p>
     <w:p>
       <w:pPr>
+        <w:pStyle w:val="Prrafodelista"/>
         <w:numPr>
           <w:ilvl w:val="0"/>
-          <w:numId w:val="12"/>
+          <w:numId w:val="25"/>
         </w:numPr>
+        <w:ind w:left="1134"/>
+        <w:jc w:val="both"/>
       </w:pPr>
       <w:r>
         <w:t>Responsabilidades: Diseño y ejecución de la suite de pruebas automatizadas (</w:t>
@@ -3607,6 +3943,12 @@
     </w:p>
     <w:p>
       <w:pPr>
+        <w:pStyle w:val="Prrafodelista"/>
+        <w:numPr>
+          <w:ilvl w:val="0"/>
+          <w:numId w:val="25"/>
+        </w:numPr>
+        <w:ind w:left="1134"/>
         <w:rPr>
           <w:b/>
           <w:bCs/>
@@ -4725,6 +5067,27 @@
         </w:tc>
       </w:tr>
     </w:tbl>
+    <w:p/>
+    <w:p/>
+    <w:p/>
+    <w:p/>
+    <w:p>
+      <w:pPr>
+        <w:rPr>
+          <w:b/>
+          <w:bCs/>
+          <w:color w:val="2D3748"/>
+          <w:sz w:val="28"/>
+          <w:szCs w:val="28"/>
+        </w:rPr>
+      </w:pPr>
+      <w:r>
+        <w:rPr>
+          <w:color w:val="2D3748"/>
+        </w:rPr>
+        <w:br w:type="page"/>
+      </w:r>
+    </w:p>
     <w:p>
       <w:pPr>
         <w:pStyle w:val="Ttulo3"/>
@@ -4733,46 +5096,11 @@
           <w:color w:val="2D3748"/>
         </w:rPr>
       </w:pPr>
-    </w:p>
-    <w:p>
-      <w:pPr>
-        <w:pStyle w:val="Ttulo3"/>
-        <w:spacing w:before="360"/>
+      <w:r>
         <w:rPr>
           <w:color w:val="2D3748"/>
         </w:rPr>
-      </w:pPr>
-    </w:p>
-    <w:p>
-      <w:pPr>
-        <w:pStyle w:val="Ttulo3"/>
-        <w:spacing w:before="360"/>
-        <w:rPr>
-          <w:color w:val="2D3748"/>
-        </w:rPr>
-      </w:pPr>
-    </w:p>
-    <w:p>
-      <w:pPr>
-        <w:pStyle w:val="Ttulo3"/>
-        <w:spacing w:before="360"/>
-        <w:rPr>
-          <w:color w:val="2D3748"/>
-        </w:rPr>
-      </w:pPr>
-    </w:p>
-    <w:p>
-      <w:pPr>
-        <w:pStyle w:val="Ttulo3"/>
-        <w:spacing w:before="360"/>
-        <w:rPr>
-          <w:color w:val="2D3748"/>
-        </w:rPr>
-      </w:pPr>
-      <w:r>
-        <w:rPr>
-          <w:color w:val="2D3748"/>
-        </w:rPr>
+        <w:lastRenderedPageBreak/>
         <w:t>7. Plan de Trabajo</w:t>
       </w:r>
     </w:p>
@@ -7566,6 +7894,20 @@
         </w:tc>
       </w:tr>
     </w:tbl>
+    <w:p/>
+    <w:p>
+      <w:pPr>
+        <w:rPr>
+          <w:b/>
+          <w:bCs/>
+          <w:sz w:val="28"/>
+          <w:szCs w:val="28"/>
+        </w:rPr>
+      </w:pPr>
+      <w:r>
+        <w:br w:type="page"/>
+      </w:r>
+    </w:p>
     <w:p>
       <w:pPr>
         <w:pStyle w:val="Ttulo3"/>
@@ -7574,19 +7916,11 @@
           <w:color w:val="2D3748"/>
         </w:rPr>
       </w:pPr>
-    </w:p>
-    <w:p>
-      <w:pPr>
-        <w:pStyle w:val="Ttulo3"/>
-        <w:spacing w:before="360"/>
+      <w:r>
         <w:rPr>
           <w:color w:val="2D3748"/>
         </w:rPr>
-      </w:pPr>
-      <w:r>
-        <w:rPr>
-          <w:color w:val="2D3748"/>
-        </w:rPr>
+        <w:lastRenderedPageBreak/>
         <w:t>8. Carta Gantt</w:t>
       </w:r>
     </w:p>
@@ -8765,15 +9099,6 @@
                 <w:szCs w:val="16"/>
               </w:rPr>
             </w:pPr>
-            <w:r>
-              <w:rPr>
-                <w:b/>
-                <w:bCs/>
-                <w:sz w:val="16"/>
-                <w:szCs w:val="16"/>
-              </w:rPr>
-              <w:t>X</w:t>
-            </w:r>
           </w:p>
         </w:tc>
         <w:tc>
@@ -8810,15 +9135,6 @@
                 <w:szCs w:val="16"/>
               </w:rPr>
             </w:pPr>
-            <w:r>
-              <w:rPr>
-                <w:b/>
-                <w:bCs/>
-                <w:sz w:val="16"/>
-                <w:szCs w:val="16"/>
-              </w:rPr>
-              <w:t>X</w:t>
-            </w:r>
           </w:p>
         </w:tc>
         <w:tc>
@@ -9542,15 +9858,6 @@
                 <w:szCs w:val="16"/>
               </w:rPr>
             </w:pPr>
-            <w:r>
-              <w:rPr>
-                <w:b/>
-                <w:bCs/>
-                <w:sz w:val="16"/>
-                <w:szCs w:val="16"/>
-              </w:rPr>
-              <w:t>X</w:t>
-            </w:r>
           </w:p>
         </w:tc>
         <w:tc>
@@ -9587,15 +9894,6 @@
                 <w:szCs w:val="16"/>
               </w:rPr>
             </w:pPr>
-            <w:r>
-              <w:rPr>
-                <w:b/>
-                <w:bCs/>
-                <w:sz w:val="16"/>
-                <w:szCs w:val="16"/>
-              </w:rPr>
-              <w:t>X</w:t>
-            </w:r>
           </w:p>
         </w:tc>
         <w:tc>
@@ -10277,15 +10575,6 @@
                 <w:szCs w:val="16"/>
               </w:rPr>
             </w:pPr>
-            <w:r>
-              <w:rPr>
-                <w:b/>
-                <w:bCs/>
-                <w:sz w:val="16"/>
-                <w:szCs w:val="16"/>
-              </w:rPr>
-              <w:t>X</w:t>
-            </w:r>
           </w:p>
         </w:tc>
         <w:tc>
@@ -11023,15 +11312,6 @@
                 <w:szCs w:val="16"/>
               </w:rPr>
             </w:pPr>
-            <w:r>
-              <w:rPr>
-                <w:b/>
-                <w:bCs/>
-                <w:sz w:val="16"/>
-                <w:szCs w:val="16"/>
-              </w:rPr>
-              <w:t>X</w:t>
-            </w:r>
           </w:p>
         </w:tc>
         <w:tc>
@@ -11068,15 +11348,6 @@
                 <w:szCs w:val="16"/>
               </w:rPr>
             </w:pPr>
-            <w:r>
-              <w:rPr>
-                <w:b/>
-                <w:bCs/>
-                <w:sz w:val="16"/>
-                <w:szCs w:val="16"/>
-              </w:rPr>
-              <w:t>X</w:t>
-            </w:r>
           </w:p>
         </w:tc>
         <w:tc>
@@ -11784,15 +12055,6 @@
                 <w:szCs w:val="16"/>
               </w:rPr>
             </w:pPr>
-            <w:r>
-              <w:rPr>
-                <w:b/>
-                <w:bCs/>
-                <w:sz w:val="16"/>
-                <w:szCs w:val="16"/>
-              </w:rPr>
-              <w:t>X</w:t>
-            </w:r>
           </w:p>
         </w:tc>
         <w:tc>
@@ -11829,15 +12091,6 @@
                 <w:szCs w:val="16"/>
               </w:rPr>
             </w:pPr>
-            <w:r>
-              <w:rPr>
-                <w:b/>
-                <w:bCs/>
-                <w:sz w:val="16"/>
-                <w:szCs w:val="16"/>
-              </w:rPr>
-              <w:t>X</w:t>
-            </w:r>
           </w:p>
         </w:tc>
         <w:tc>
@@ -11874,15 +12127,6 @@
                 <w:szCs w:val="16"/>
               </w:rPr>
             </w:pPr>
-            <w:r>
-              <w:rPr>
-                <w:b/>
-                <w:bCs/>
-                <w:sz w:val="16"/>
-                <w:szCs w:val="16"/>
-              </w:rPr>
-              <w:t>X</w:t>
-            </w:r>
           </w:p>
         </w:tc>
         <w:tc>
@@ -11919,15 +12163,6 @@
                 <w:szCs w:val="16"/>
               </w:rPr>
             </w:pPr>
-            <w:r>
-              <w:rPr>
-                <w:b/>
-                <w:bCs/>
-                <w:sz w:val="16"/>
-                <w:szCs w:val="16"/>
-              </w:rPr>
-              <w:t>X</w:t>
-            </w:r>
           </w:p>
         </w:tc>
         <w:tc>
@@ -12594,15 +12829,6 @@
                 <w:szCs w:val="16"/>
               </w:rPr>
             </w:pPr>
-            <w:r>
-              <w:rPr>
-                <w:b/>
-                <w:bCs/>
-                <w:sz w:val="16"/>
-                <w:szCs w:val="16"/>
-              </w:rPr>
-              <w:t>X</w:t>
-            </w:r>
           </w:p>
         </w:tc>
         <w:tc>
@@ -12639,15 +12865,6 @@
                 <w:szCs w:val="16"/>
               </w:rPr>
             </w:pPr>
-            <w:r>
-              <w:rPr>
-                <w:b/>
-                <w:bCs/>
-                <w:sz w:val="16"/>
-                <w:szCs w:val="16"/>
-              </w:rPr>
-              <w:t>X</w:t>
-            </w:r>
           </w:p>
         </w:tc>
         <w:tc>
@@ -12684,15 +12901,6 @@
                 <w:szCs w:val="16"/>
               </w:rPr>
             </w:pPr>
-            <w:r>
-              <w:rPr>
-                <w:b/>
-                <w:bCs/>
-                <w:sz w:val="16"/>
-                <w:szCs w:val="16"/>
-              </w:rPr>
-              <w:t>X</w:t>
-            </w:r>
           </w:p>
         </w:tc>
         <w:tc>
@@ -12729,15 +12937,6 @@
                 <w:szCs w:val="16"/>
               </w:rPr>
             </w:pPr>
-            <w:r>
-              <w:rPr>
-                <w:b/>
-                <w:bCs/>
-                <w:sz w:val="16"/>
-                <w:szCs w:val="16"/>
-              </w:rPr>
-              <w:t>X</w:t>
-            </w:r>
           </w:p>
         </w:tc>
         <w:tc>
@@ -13329,15 +13528,6 @@
                 <w:szCs w:val="16"/>
               </w:rPr>
             </w:pPr>
-            <w:r>
-              <w:rPr>
-                <w:b/>
-                <w:bCs/>
-                <w:sz w:val="16"/>
-                <w:szCs w:val="16"/>
-              </w:rPr>
-              <w:t>X</w:t>
-            </w:r>
           </w:p>
         </w:tc>
         <w:tc>
@@ -14062,15 +14252,6 @@
                 <w:szCs w:val="16"/>
               </w:rPr>
             </w:pPr>
-            <w:r>
-              <w:rPr>
-                <w:b/>
-                <w:bCs/>
-                <w:sz w:val="16"/>
-                <w:szCs w:val="16"/>
-              </w:rPr>
-              <w:t>X</w:t>
-            </w:r>
           </w:p>
         </w:tc>
         <w:tc>
@@ -14107,15 +14288,6 @@
                 <w:szCs w:val="16"/>
               </w:rPr>
             </w:pPr>
-            <w:r>
-              <w:rPr>
-                <w:b/>
-                <w:bCs/>
-                <w:sz w:val="16"/>
-                <w:szCs w:val="16"/>
-              </w:rPr>
-              <w:t>X</w:t>
-            </w:r>
           </w:p>
         </w:tc>
         <w:tc>
@@ -14152,15 +14324,6 @@
                 <w:szCs w:val="16"/>
               </w:rPr>
             </w:pPr>
-            <w:r>
-              <w:rPr>
-                <w:b/>
-                <w:bCs/>
-                <w:sz w:val="16"/>
-                <w:szCs w:val="16"/>
-              </w:rPr>
-              <w:t>X</w:t>
-            </w:r>
           </w:p>
         </w:tc>
         <w:tc>
@@ -14856,15 +15019,6 @@
                 <w:szCs w:val="16"/>
               </w:rPr>
             </w:pPr>
-            <w:r>
-              <w:rPr>
-                <w:b/>
-                <w:bCs/>
-                <w:sz w:val="16"/>
-                <w:szCs w:val="16"/>
-              </w:rPr>
-              <w:t>X</w:t>
-            </w:r>
           </w:p>
         </w:tc>
         <w:tc>
@@ -14901,15 +15055,6 @@
                 <w:szCs w:val="16"/>
               </w:rPr>
             </w:pPr>
-            <w:r>
-              <w:rPr>
-                <w:b/>
-                <w:bCs/>
-                <w:sz w:val="16"/>
-                <w:szCs w:val="16"/>
-              </w:rPr>
-              <w:t>X</w:t>
-            </w:r>
           </w:p>
         </w:tc>
         <w:tc>
@@ -14946,15 +15091,6 @@
                 <w:szCs w:val="16"/>
               </w:rPr>
             </w:pPr>
-            <w:r>
-              <w:rPr>
-                <w:b/>
-                <w:bCs/>
-                <w:sz w:val="16"/>
-                <w:szCs w:val="16"/>
-              </w:rPr>
-              <w:t>X</w:t>
-            </w:r>
           </w:p>
         </w:tc>
         <w:tc>
@@ -15101,15 +15237,7 @@
                 <w:sz w:val="16"/>
                 <w:szCs w:val="16"/>
               </w:rPr>
-              <w:t xml:space="preserve">10. Despliegue en </w:t>
-            </w:r>
-            <w:r>
-              <w:rPr>
-                <w:sz w:val="16"/>
-                <w:szCs w:val="16"/>
-              </w:rPr>
-              <w:lastRenderedPageBreak/>
-              <w:t xml:space="preserve">Producción &amp; </w:t>
+              <w:t xml:space="preserve">10. Despliegue en Producción &amp; </w:t>
             </w:r>
             <w:proofErr w:type="spellStart"/>
             <w:r>
@@ -15673,15 +15801,6 @@
                 <w:szCs w:val="16"/>
               </w:rPr>
             </w:pPr>
-            <w:r>
-              <w:rPr>
-                <w:b/>
-                <w:bCs/>
-                <w:sz w:val="16"/>
-                <w:szCs w:val="16"/>
-              </w:rPr>
-              <w:t>X</w:t>
-            </w:r>
           </w:p>
         </w:tc>
         <w:tc>
@@ -15718,15 +15837,6 @@
                 <w:szCs w:val="16"/>
               </w:rPr>
             </w:pPr>
-            <w:r>
-              <w:rPr>
-                <w:b/>
-                <w:bCs/>
-                <w:sz w:val="16"/>
-                <w:szCs w:val="16"/>
-              </w:rPr>
-              <w:t>X</w:t>
-            </w:r>
           </w:p>
         </w:tc>
         <w:tc>
@@ -16402,15 +16512,6 @@
                 <w:szCs w:val="16"/>
               </w:rPr>
             </w:pPr>
-            <w:r>
-              <w:rPr>
-                <w:b/>
-                <w:bCs/>
-                <w:sz w:val="16"/>
-                <w:szCs w:val="16"/>
-              </w:rPr>
-              <w:t>X</w:t>
-            </w:r>
           </w:p>
         </w:tc>
       </w:tr>
@@ -16467,18 +16568,370 @@
       </w:r>
     </w:p>
     <w:sectPr>
+      <w:headerReference w:type="first" r:id="rId10"/>
       <w:pgSz w:w="12240" w:h="15840"/>
       <w:pgMar w:top="1440" w:right="1440" w:bottom="1440" w:left="1440" w:header="0" w:footer="720" w:gutter="0"/>
       <w:pgNumType w:start="1"/>
       <w:cols w:space="720"/>
+      <w:titlePg/>
+      <w:docGrid w:linePitch="299"/>
     </w:sectPr>
   </w:body>
 </w:document>
 </file>
 
+<file path=word/endnotes.xml><?xml version="1.0" encoding="utf-8"?>
+<w:endnotes xmlns:wpc="http://schemas.microsoft.com/office/word/2010/wordprocessingCanvas" xmlns:cx="http://schemas.microsoft.com/office/drawing/2014/chartex" xmlns:cx1="http://schemas.microsoft.com/office/drawing/2015/9/8/chartex" xmlns:cx2="http://schemas.microsoft.com/office/drawing/2015/10/21/chartex" xmlns:cx3="http://schemas.microsoft.com/office/drawing/2016/5/9/chartex" xmlns:cx4="http://schemas.microsoft.com/office/drawing/2016/5/10/chartex" xmlns:cx5="http://schemas.microsoft.com/office/drawing/2016/5/11/chartex" xmlns:cx6="http://schemas.microsoft.com/office/drawing/2016/5/12/chartex" xmlns:cx7="http://schemas.microsoft.com/office/drawing/2016/5/13/chartex" xmlns:cx8="http://schemas.microsoft.com/office/drawing/2016/5/14/chartex" xmlns:mc="http://schemas.openxmlformats.org/markup-compatibility/2006" xmlns:aink="http://schemas.microsoft.com/office/drawing/2016/ink" xmlns:am3d="http://schemas.microsoft.com/office/drawing/2017/model3d" xmlns:o="urn:schemas-microsoft-com:office:office" xmlns:oel="http://schemas.microsoft.com/office/2019/extlst" xmlns:r="http://schemas.openxmlformats.org/officeDocument/2006/relationships" xmlns:m="http://schemas.openxmlformats.org/officeDocument/2006/math" xmlns:v="urn:schemas-microsoft-com:vml" xmlns:wp14="http://schemas.microsoft.com/office/word/2010/wordprocessingDrawing" xmlns:wp="http://schemas.openxmlformats.org/drawingml/2006/wordprocessingDrawing" xmlns:w10="urn:schemas-microsoft-com:office:word" xmlns:w="http://schemas.openxmlformats.org/wordprocessingml/2006/main" xmlns:w14="http://schemas.microsoft.com/office/word/2010/wordml" xmlns:w15="http://schemas.microsoft.com/office/word/2012/wordml" xmlns:w16cex="http://schemas.microsoft.com/office/word/2018/wordml/cex" xmlns:w16cid="http://schemas.microsoft.com/office/word/2016/wordml/cid" xmlns:w16="http://schemas.microsoft.com/office/word/2018/wordml" xmlns:w16du="http://schemas.microsoft.com/office/word/2023/wordml/word16du" xmlns:w16sdtdh="http://schemas.microsoft.com/office/word/2020/wordml/sdtdatahash" xmlns:w16sdtfl="http://schemas.microsoft.com/office/word/2024/wordml/sdtformatlock" xmlns:w16se="http://schemas.microsoft.com/office/word/2015/wordml/symex" xmlns:wpg="http://schemas.microsoft.com/office/word/2010/wordprocessingGroup" xmlns:wpi="http://schemas.microsoft.com/office/word/2010/wordprocessingInk" xmlns:wne="http://schemas.microsoft.com/office/word/2006/wordml" xmlns:wps="http://schemas.microsoft.com/office/word/2010/wordprocessingShape" mc:Ignorable="w14 w15 w16se w16cid w16 w16cex w16sdtdh w16sdtfl w16du wp14">
+  <w:endnote w:type="separator" w:id="-1">
+    <w:p>
+      <w:r>
+        <w:separator/>
+      </w:r>
+    </w:p>
+  </w:endnote>
+  <w:endnote w:type="continuationSeparator" w:id="0">
+    <w:p>
+      <w:r>
+        <w:continuationSeparator/>
+      </w:r>
+    </w:p>
+  </w:endnote>
+</w:endnotes>
+</file>
+
+<file path=word/footnotes.xml><?xml version="1.0" encoding="utf-8"?>
+<w:footnotes xmlns:wpc="http://schemas.microsoft.com/office/word/2010/wordprocessingCanvas" xmlns:cx="http://schemas.microsoft.com/office/drawing/2014/chartex" xmlns:cx1="http://schemas.microsoft.com/office/drawing/2015/9/8/chartex" xmlns:cx2="http://schemas.microsoft.com/office/drawing/2015/10/21/chartex" xmlns:cx3="http://schemas.microsoft.com/office/drawing/2016/5/9/chartex" xmlns:cx4="http://schemas.microsoft.com/office/drawing/2016/5/10/chartex" xmlns:cx5="http://schemas.microsoft.com/office/drawing/2016/5/11/chartex" xmlns:cx6="http://schemas.microsoft.com/office/drawing/2016/5/12/chartex" xmlns:cx7="http://schemas.microsoft.com/office/drawing/2016/5/13/chartex" xmlns:cx8="http://schemas.microsoft.com/office/drawing/2016/5/14/chartex" xmlns:mc="http://schemas.openxmlformats.org/markup-compatibility/2006" xmlns:aink="http://schemas.microsoft.com/office/drawing/2016/ink" xmlns:am3d="http://schemas.microsoft.com/office/drawing/2017/model3d" xmlns:o="urn:schemas-microsoft-com:office:office" xmlns:oel="http://schemas.microsoft.com/office/2019/extlst" xmlns:r="http://schemas.openxmlformats.org/officeDocument/2006/relationships" xmlns:m="http://schemas.openxmlformats.org/officeDocument/2006/math" xmlns:v="urn:schemas-microsoft-com:vml" xmlns:wp14="http://schemas.microsoft.com/office/word/2010/wordprocessingDrawing" xmlns:wp="http://schemas.openxmlformats.org/drawingml/2006/wordprocessingDrawing" xmlns:w10="urn:schemas-microsoft-com:office:word" xmlns:w="http://schemas.openxmlformats.org/wordprocessingml/2006/main" xmlns:w14="http://schemas.microsoft.com/office/word/2010/wordml" xmlns:w15="http://schemas.microsoft.com/office/word/2012/wordml" xmlns:w16cex="http://schemas.microsoft.com/office/word/2018/wordml/cex" xmlns:w16cid="http://schemas.microsoft.com/office/word/2016/wordml/cid" xmlns:w16="http://schemas.microsoft.com/office/word/2018/wordml" xmlns:w16du="http://schemas.microsoft.com/office/word/2023/wordml/word16du" xmlns:w16sdtdh="http://schemas.microsoft.com/office/word/2020/wordml/sdtdatahash" xmlns:w16sdtfl="http://schemas.microsoft.com/office/word/2024/wordml/sdtformatlock" xmlns:w16se="http://schemas.microsoft.com/office/word/2015/wordml/symex" xmlns:wpg="http://schemas.microsoft.com/office/word/2010/wordprocessingGroup" xmlns:wpi="http://schemas.microsoft.com/office/word/2010/wordprocessingInk" xmlns:wne="http://schemas.microsoft.com/office/word/2006/wordml" xmlns:wps="http://schemas.microsoft.com/office/word/2010/wordprocessingShape" mc:Ignorable="w14 w15 w16se w16cid w16 w16cex w16sdtdh w16sdtfl w16du wp14">
+  <w:footnote w:type="separator" w:id="-1">
+    <w:p>
+      <w:r>
+        <w:separator/>
+      </w:r>
+    </w:p>
+  </w:footnote>
+  <w:footnote w:type="continuationSeparator" w:id="0">
+    <w:p>
+      <w:r>
+        <w:continuationSeparator/>
+      </w:r>
+    </w:p>
+  </w:footnote>
+</w:footnotes>
+</file>
+
+<file path=word/header1.xml><?xml version="1.0" encoding="utf-8"?>
+<w:hdr xmlns:wpc="http://schemas.microsoft.com/office/word/2010/wordprocessingCanvas" xmlns:cx="http://schemas.microsoft.com/office/drawing/2014/chartex" xmlns:cx1="http://schemas.microsoft.com/office/drawing/2015/9/8/chartex" xmlns:cx2="http://schemas.microsoft.com/office/drawing/2015/10/21/chartex" xmlns:cx3="http://schemas.microsoft.com/office/drawing/2016/5/9/chartex" xmlns:cx4="http://schemas.microsoft.com/office/drawing/2016/5/10/chartex" xmlns:cx5="http://schemas.microsoft.com/office/drawing/2016/5/11/chartex" xmlns:cx6="http://schemas.microsoft.com/office/drawing/2016/5/12/chartex" xmlns:cx7="http://schemas.microsoft.com/office/drawing/2016/5/13/chartex" xmlns:cx8="http://schemas.microsoft.com/office/drawing/2016/5/14/chartex" xmlns:mc="http://schemas.openxmlformats.org/markup-compatibility/2006" xmlns:aink="http://schemas.microsoft.com/office/drawing/2016/ink" xmlns:am3d="http://schemas.microsoft.com/office/drawing/2017/model3d" xmlns:o="urn:schemas-microsoft-com:office:office" xmlns:oel="http://schemas.microsoft.com/office/2019/extlst" xmlns:r="http://schemas.openxmlformats.org/officeDocument/2006/relationships" xmlns:m="http://schemas.openxmlformats.org/officeDocument/2006/math" xmlns:v="urn:schemas-microsoft-com:vml" xmlns:wp14="http://schemas.microsoft.com/office/word/2010/wordprocessingDrawing" xmlns:wp="http://schemas.openxmlformats.org/drawingml/2006/wordprocessingDrawing" xmlns:w10="urn:schemas-microsoft-com:office:word" xmlns:w="http://schemas.openxmlformats.org/wordprocessingml/2006/main" xmlns:w14="http://schemas.microsoft.com/office/word/2010/wordml" xmlns:w15="http://schemas.microsoft.com/office/word/2012/wordml" xmlns:w16cex="http://schemas.microsoft.com/office/word/2018/wordml/cex" xmlns:w16cid="http://schemas.microsoft.com/office/word/2016/wordml/cid" xmlns:w16="http://schemas.microsoft.com/office/word/2018/wordml" xmlns:w16du="http://schemas.microsoft.com/office/word/2023/wordml/word16du" xmlns:w16sdtdh="http://schemas.microsoft.com/office/word/2020/wordml/sdtdatahash" xmlns:w16sdtfl="http://schemas.microsoft.com/office/word/2024/wordml/sdtformatlock" xmlns:w16se="http://schemas.microsoft.com/office/word/2015/wordml/symex" xmlns:wpg="http://schemas.microsoft.com/office/word/2010/wordprocessingGroup" xmlns:wpi="http://schemas.microsoft.com/office/word/2010/wordprocessingInk" xmlns:wne="http://schemas.microsoft.com/office/word/2006/wordml" xmlns:wps="http://schemas.microsoft.com/office/word/2010/wordprocessingShape" mc:Ignorable="w14 w15 w16se w16cid w16 w16cex w16sdtdh w16sdtfl w16du wp14">
+  <w:p>
+    <w:pPr>
+      <w:pStyle w:val="Encabezado"/>
+    </w:pPr>
+    <w:r>
+      <w:rPr>
+        <w:noProof/>
+        <w:color w:val="1A365D"/>
+      </w:rPr>
+      <w:drawing>
+        <wp:anchor distT="0" distB="0" distL="114300" distR="114300" simplePos="0" relativeHeight="251659264" behindDoc="0" locked="0" layoutInCell="1" allowOverlap="1" wp14:anchorId="5E724170" wp14:editId="0CCDECA4">
+          <wp:simplePos x="0" y="0"/>
+          <wp:positionH relativeFrom="margin">
+            <wp:posOffset>-657225</wp:posOffset>
+          </wp:positionH>
+          <wp:positionV relativeFrom="paragraph">
+            <wp:posOffset>228600</wp:posOffset>
+          </wp:positionV>
+          <wp:extent cx="1934845" cy="476250"/>
+          <wp:effectExtent l="0" t="0" r="8255" b="0"/>
+          <wp:wrapThrough wrapText="bothSides">
+            <wp:wrapPolygon edited="0">
+              <wp:start x="18927" y="0"/>
+              <wp:lineTo x="0" y="4320"/>
+              <wp:lineTo x="0" y="19872"/>
+              <wp:lineTo x="18502" y="20736"/>
+              <wp:lineTo x="20416" y="20736"/>
+              <wp:lineTo x="20629" y="19872"/>
+              <wp:lineTo x="21479" y="15552"/>
+              <wp:lineTo x="21479" y="9504"/>
+              <wp:lineTo x="21054" y="5184"/>
+              <wp:lineTo x="19991" y="0"/>
+              <wp:lineTo x="18927" y="0"/>
+            </wp:wrapPolygon>
+          </wp:wrapThrough>
+          <wp:docPr id="1134944027" name="Gráfico 2"/>
+          <wp:cNvGraphicFramePr>
+            <a:graphicFrameLocks xmlns:a="http://schemas.openxmlformats.org/drawingml/2006/main" noChangeAspect="1"/>
+          </wp:cNvGraphicFramePr>
+          <a:graphic xmlns:a="http://schemas.openxmlformats.org/drawingml/2006/main">
+            <a:graphicData uri="http://schemas.openxmlformats.org/drawingml/2006/picture">
+              <pic:pic xmlns:pic="http://schemas.openxmlformats.org/drawingml/2006/picture">
+                <pic:nvPicPr>
+                  <pic:cNvPr id="1134944027" name="Gráfico 1134944027"/>
+                  <pic:cNvPicPr/>
+                </pic:nvPicPr>
+                <pic:blipFill>
+                  <a:blip r:embed="rId1">
+                    <a:extLst>
+                      <a:ext uri="{96DAC541-7B7A-43D3-8B79-37D633B846F1}">
+                        <asvg:svgBlip xmlns:asvg="http://schemas.microsoft.com/office/drawing/2016/SVG/main" r:embed="rId2"/>
+                      </a:ext>
+                    </a:extLst>
+                  </a:blip>
+                  <a:stretch>
+                    <a:fillRect/>
+                  </a:stretch>
+                </pic:blipFill>
+                <pic:spPr>
+                  <a:xfrm>
+                    <a:off x="0" y="0"/>
+                    <a:ext cx="1934845" cy="476250"/>
+                  </a:xfrm>
+                  <a:prstGeom prst="rect">
+                    <a:avLst/>
+                  </a:prstGeom>
+                </pic:spPr>
+              </pic:pic>
+            </a:graphicData>
+          </a:graphic>
+          <wp14:sizeRelH relativeFrom="page">
+            <wp14:pctWidth>0</wp14:pctWidth>
+          </wp14:sizeRelH>
+          <wp14:sizeRelV relativeFrom="page">
+            <wp14:pctHeight>0</wp14:pctHeight>
+          </wp14:sizeRelV>
+        </wp:anchor>
+      </w:drawing>
+    </w:r>
+  </w:p>
+</w:hdr>
+</file>
+
 <file path=word/numbering.xml><?xml version="1.0" encoding="utf-8"?>
 <w:numbering xmlns:wpc="http://schemas.microsoft.com/office/word/2010/wordprocessingCanvas" xmlns:cx="http://schemas.microsoft.com/office/drawing/2014/chartex" xmlns:cx1="http://schemas.microsoft.com/office/drawing/2015/9/8/chartex" xmlns:cx2="http://schemas.microsoft.com/office/drawing/2015/10/21/chartex" xmlns:cx3="http://schemas.microsoft.com/office/drawing/2016/5/9/chartex" xmlns:cx4="http://schemas.microsoft.com/office/drawing/2016/5/10/chartex" xmlns:cx5="http://schemas.microsoft.com/office/drawing/2016/5/11/chartex" xmlns:cx6="http://schemas.microsoft.com/office/drawing/2016/5/12/chartex" xmlns:cx7="http://schemas.microsoft.com/office/drawing/2016/5/13/chartex" xmlns:cx8="http://schemas.microsoft.com/office/drawing/2016/5/14/chartex" xmlns:mc="http://schemas.openxmlformats.org/markup-compatibility/2006" xmlns:aink="http://schemas.microsoft.com/office/drawing/2016/ink" xmlns:am3d="http://schemas.microsoft.com/office/drawing/2017/model3d" xmlns:o="urn:schemas-microsoft-com:office:office" xmlns:oel="http://schemas.microsoft.com/office/2019/extlst" xmlns:r="http://schemas.openxmlformats.org/officeDocument/2006/relationships" xmlns:m="http://schemas.openxmlformats.org/officeDocument/2006/math" xmlns:v="urn:schemas-microsoft-com:vml" xmlns:wp14="http://schemas.microsoft.com/office/word/2010/wordprocessingDrawing" xmlns:wp="http://schemas.openxmlformats.org/drawingml/2006/wordprocessingDrawing" xmlns:w10="urn:schemas-microsoft-com:office:word" xmlns:w="http://schemas.openxmlformats.org/wordprocessingml/2006/main" xmlns:w14="http://schemas.microsoft.com/office/word/2010/wordml" xmlns:w15="http://schemas.microsoft.com/office/word/2012/wordml" xmlns:w16cex="http://schemas.microsoft.com/office/word/2018/wordml/cex" xmlns:w16cid="http://schemas.microsoft.com/office/word/2016/wordml/cid" xmlns:w16="http://schemas.microsoft.com/office/word/2018/wordml" xmlns:w16du="http://schemas.microsoft.com/office/word/2023/wordml/word16du" xmlns:w16sdtdh="http://schemas.microsoft.com/office/word/2020/wordml/sdtdatahash" xmlns:w16sdtfl="http://schemas.microsoft.com/office/word/2024/wordml/sdtformatlock" xmlns:w16se="http://schemas.microsoft.com/office/word/2015/wordml/symex" xmlns:wpg="http://schemas.microsoft.com/office/word/2010/wordprocessingGroup" xmlns:wpi="http://schemas.microsoft.com/office/word/2010/wordprocessingInk" xmlns:wne="http://schemas.microsoft.com/office/word/2006/wordml" xmlns:wps="http://schemas.microsoft.com/office/word/2010/wordprocessingShape" mc:Ignorable="w14 w15 w16se w16cid w16 w16cex w16sdtdh w16sdtfl w16du wp14">
   <w:abstractNum w:abstractNumId="0" w15:restartNumberingAfterBreak="0">
+    <w:nsid w:val="015D7048"/>
+    <w:multiLevelType w:val="hybridMultilevel"/>
+    <w:tmpl w:val="AD9EFA98"/>
+    <w:lvl w:ilvl="0" w:tplc="340A0005">
+      <w:start w:val="1"/>
+      <w:numFmt w:val="bullet"/>
+      <w:lvlText w:val=""/>
+      <w:lvlJc w:val="left"/>
+      <w:pPr>
+        <w:ind w:left="720" w:hanging="360"/>
+      </w:pPr>
+      <w:rPr>
+        <w:rFonts w:ascii="Wingdings" w:hAnsi="Wingdings" w:hint="default"/>
+      </w:rPr>
+    </w:lvl>
+    <w:lvl w:ilvl="1" w:tplc="340A0003" w:tentative="1">
+      <w:start w:val="1"/>
+      <w:numFmt w:val="bullet"/>
+      <w:lvlText w:val="o"/>
+      <w:lvlJc w:val="left"/>
+      <w:pPr>
+        <w:ind w:left="1440" w:hanging="360"/>
+      </w:pPr>
+      <w:rPr>
+        <w:rFonts w:ascii="Courier New" w:hAnsi="Courier New" w:cs="Courier New" w:hint="default"/>
+      </w:rPr>
+    </w:lvl>
+    <w:lvl w:ilvl="2" w:tplc="340A0005" w:tentative="1">
+      <w:start w:val="1"/>
+      <w:numFmt w:val="bullet"/>
+      <w:lvlText w:val=""/>
+      <w:lvlJc w:val="left"/>
+      <w:pPr>
+        <w:ind w:left="2160" w:hanging="360"/>
+      </w:pPr>
+      <w:rPr>
+        <w:rFonts w:ascii="Wingdings" w:hAnsi="Wingdings" w:hint="default"/>
+      </w:rPr>
+    </w:lvl>
+    <w:lvl w:ilvl="3" w:tplc="340A0001" w:tentative="1">
+      <w:start w:val="1"/>
+      <w:numFmt w:val="bullet"/>
+      <w:lvlText w:val=""/>
+      <w:lvlJc w:val="left"/>
+      <w:pPr>
+        <w:ind w:left="2880" w:hanging="360"/>
+      </w:pPr>
+      <w:rPr>
+        <w:rFonts w:ascii="Symbol" w:hAnsi="Symbol" w:hint="default"/>
+      </w:rPr>
+    </w:lvl>
+    <w:lvl w:ilvl="4" w:tplc="340A0003" w:tentative="1">
+      <w:start w:val="1"/>
+      <w:numFmt w:val="bullet"/>
+      <w:lvlText w:val="o"/>
+      <w:lvlJc w:val="left"/>
+      <w:pPr>
+        <w:ind w:left="3600" w:hanging="360"/>
+      </w:pPr>
+      <w:rPr>
+        <w:rFonts w:ascii="Courier New" w:hAnsi="Courier New" w:cs="Courier New" w:hint="default"/>
+      </w:rPr>
+    </w:lvl>
+    <w:lvl w:ilvl="5" w:tplc="340A0005" w:tentative="1">
+      <w:start w:val="1"/>
+      <w:numFmt w:val="bullet"/>
+      <w:lvlText w:val=""/>
+      <w:lvlJc w:val="left"/>
+      <w:pPr>
+        <w:ind w:left="4320" w:hanging="360"/>
+      </w:pPr>
+      <w:rPr>
+        <w:rFonts w:ascii="Wingdings" w:hAnsi="Wingdings" w:hint="default"/>
+      </w:rPr>
+    </w:lvl>
+    <w:lvl w:ilvl="6" w:tplc="340A0001" w:tentative="1">
+      <w:start w:val="1"/>
+      <w:numFmt w:val="bullet"/>
+      <w:lvlText w:val=""/>
+      <w:lvlJc w:val="left"/>
+      <w:pPr>
+        <w:ind w:left="5040" w:hanging="360"/>
+      </w:pPr>
+      <w:rPr>
+        <w:rFonts w:ascii="Symbol" w:hAnsi="Symbol" w:hint="default"/>
+      </w:rPr>
+    </w:lvl>
+    <w:lvl w:ilvl="7" w:tplc="340A0003" w:tentative="1">
+      <w:start w:val="1"/>
+      <w:numFmt w:val="bullet"/>
+      <w:lvlText w:val="o"/>
+      <w:lvlJc w:val="left"/>
+      <w:pPr>
+        <w:ind w:left="5760" w:hanging="360"/>
+      </w:pPr>
+      <w:rPr>
+        <w:rFonts w:ascii="Courier New" w:hAnsi="Courier New" w:cs="Courier New" w:hint="default"/>
+      </w:rPr>
+    </w:lvl>
+    <w:lvl w:ilvl="8" w:tplc="340A0005" w:tentative="1">
+      <w:start w:val="1"/>
+      <w:numFmt w:val="bullet"/>
+      <w:lvlText w:val=""/>
+      <w:lvlJc w:val="left"/>
+      <w:pPr>
+        <w:ind w:left="6480" w:hanging="360"/>
+      </w:pPr>
+      <w:rPr>
+        <w:rFonts w:ascii="Wingdings" w:hAnsi="Wingdings" w:hint="default"/>
+      </w:rPr>
+    </w:lvl>
+  </w:abstractNum>
+  <w:abstractNum w:abstractNumId="1" w15:restartNumberingAfterBreak="0">
+    <w:nsid w:val="030F1263"/>
+    <w:multiLevelType w:val="hybridMultilevel"/>
+    <w:tmpl w:val="1442ACF6"/>
+    <w:lvl w:ilvl="0" w:tplc="340A0001">
+      <w:start w:val="1"/>
+      <w:numFmt w:val="bullet"/>
+      <w:lvlText w:val=""/>
+      <w:lvlJc w:val="left"/>
+      <w:pPr>
+        <w:ind w:left="1080" w:hanging="360"/>
+      </w:pPr>
+      <w:rPr>
+        <w:rFonts w:ascii="Symbol" w:hAnsi="Symbol" w:hint="default"/>
+      </w:rPr>
+    </w:lvl>
+    <w:lvl w:ilvl="1" w:tplc="340A0003" w:tentative="1">
+      <w:start w:val="1"/>
+      <w:numFmt w:val="bullet"/>
+      <w:lvlText w:val="o"/>
+      <w:lvlJc w:val="left"/>
+      <w:pPr>
+        <w:ind w:left="1800" w:hanging="360"/>
+      </w:pPr>
+      <w:rPr>
+        <w:rFonts w:ascii="Courier New" w:hAnsi="Courier New" w:cs="Courier New" w:hint="default"/>
+      </w:rPr>
+    </w:lvl>
+    <w:lvl w:ilvl="2" w:tplc="340A0005" w:tentative="1">
+      <w:start w:val="1"/>
+      <w:numFmt w:val="bullet"/>
+      <w:lvlText w:val=""/>
+      <w:lvlJc w:val="left"/>
+      <w:pPr>
+        <w:ind w:left="2520" w:hanging="360"/>
+      </w:pPr>
+      <w:rPr>
+        <w:rFonts w:ascii="Wingdings" w:hAnsi="Wingdings" w:hint="default"/>
+      </w:rPr>
+    </w:lvl>
+    <w:lvl w:ilvl="3" w:tplc="340A0001" w:tentative="1">
+      <w:start w:val="1"/>
+      <w:numFmt w:val="bullet"/>
+      <w:lvlText w:val=""/>
+      <w:lvlJc w:val="left"/>
+      <w:pPr>
+        <w:ind w:left="3240" w:hanging="360"/>
+      </w:pPr>
+      <w:rPr>
+        <w:rFonts w:ascii="Symbol" w:hAnsi="Symbol" w:hint="default"/>
+      </w:rPr>
+    </w:lvl>
+    <w:lvl w:ilvl="4" w:tplc="340A0003" w:tentative="1">
+      <w:start w:val="1"/>
+      <w:numFmt w:val="bullet"/>
+      <w:lvlText w:val="o"/>
+      <w:lvlJc w:val="left"/>
+      <w:pPr>
+        <w:ind w:left="3960" w:hanging="360"/>
+      </w:pPr>
+      <w:rPr>
+        <w:rFonts w:ascii="Courier New" w:hAnsi="Courier New" w:cs="Courier New" w:hint="default"/>
+      </w:rPr>
+    </w:lvl>
+    <w:lvl w:ilvl="5" w:tplc="340A0005" w:tentative="1">
+      <w:start w:val="1"/>
+      <w:numFmt w:val="bullet"/>
+      <w:lvlText w:val=""/>
+      <w:lvlJc w:val="left"/>
+      <w:pPr>
+        <w:ind w:left="4680" w:hanging="360"/>
+      </w:pPr>
+      <w:rPr>
+        <w:rFonts w:ascii="Wingdings" w:hAnsi="Wingdings" w:hint="default"/>
+      </w:rPr>
+    </w:lvl>
+    <w:lvl w:ilvl="6" w:tplc="340A0001" w:tentative="1">
+      <w:start w:val="1"/>
+      <w:numFmt w:val="bullet"/>
+      <w:lvlText w:val=""/>
+      <w:lvlJc w:val="left"/>
+      <w:pPr>
+        <w:ind w:left="5400" w:hanging="360"/>
+      </w:pPr>
+      <w:rPr>
+        <w:rFonts w:ascii="Symbol" w:hAnsi="Symbol" w:hint="default"/>
+      </w:rPr>
+    </w:lvl>
+    <w:lvl w:ilvl="7" w:tplc="340A0003" w:tentative="1">
+      <w:start w:val="1"/>
+      <w:numFmt w:val="bullet"/>
+      <w:lvlText w:val="o"/>
+      <w:lvlJc w:val="left"/>
+      <w:pPr>
+        <w:ind w:left="6120" w:hanging="360"/>
+      </w:pPr>
+      <w:rPr>
+        <w:rFonts w:ascii="Courier New" w:hAnsi="Courier New" w:cs="Courier New" w:hint="default"/>
+      </w:rPr>
+    </w:lvl>
+    <w:lvl w:ilvl="8" w:tplc="340A0005" w:tentative="1">
+      <w:start w:val="1"/>
+      <w:numFmt w:val="bullet"/>
+      <w:lvlText w:val=""/>
+      <w:lvlJc w:val="left"/>
+      <w:pPr>
+        <w:ind w:left="6840" w:hanging="360"/>
+      </w:pPr>
+      <w:rPr>
+        <w:rFonts w:ascii="Wingdings" w:hAnsi="Wingdings" w:hint="default"/>
+      </w:rPr>
+    </w:lvl>
+  </w:abstractNum>
+  <w:abstractNum w:abstractNumId="2" w15:restartNumberingAfterBreak="0">
     <w:nsid w:val="05195187"/>
     <w:multiLevelType w:val="multilevel"/>
     <w:tmpl w:val="D652BAB8"/>
@@ -16699,7 +17152,120 @@
       </w:rPr>
     </w:lvl>
   </w:abstractNum>
-  <w:abstractNum w:abstractNumId="1" w15:restartNumberingAfterBreak="0">
+  <w:abstractNum w:abstractNumId="3" w15:restartNumberingAfterBreak="0">
+    <w:nsid w:val="06801D15"/>
+    <w:multiLevelType w:val="hybridMultilevel"/>
+    <w:tmpl w:val="DFB607F2"/>
+    <w:lvl w:ilvl="0" w:tplc="340A0001">
+      <w:start w:val="1"/>
+      <w:numFmt w:val="bullet"/>
+      <w:lvlText w:val=""/>
+      <w:lvlJc w:val="left"/>
+      <w:pPr>
+        <w:ind w:left="720" w:hanging="360"/>
+      </w:pPr>
+      <w:rPr>
+        <w:rFonts w:ascii="Symbol" w:hAnsi="Symbol" w:hint="default"/>
+      </w:rPr>
+    </w:lvl>
+    <w:lvl w:ilvl="1" w:tplc="340A0003" w:tentative="1">
+      <w:start w:val="1"/>
+      <w:numFmt w:val="bullet"/>
+      <w:lvlText w:val="o"/>
+      <w:lvlJc w:val="left"/>
+      <w:pPr>
+        <w:ind w:left="1440" w:hanging="360"/>
+      </w:pPr>
+      <w:rPr>
+        <w:rFonts w:ascii="Courier New" w:hAnsi="Courier New" w:cs="Courier New" w:hint="default"/>
+      </w:rPr>
+    </w:lvl>
+    <w:lvl w:ilvl="2" w:tplc="340A0005" w:tentative="1">
+      <w:start w:val="1"/>
+      <w:numFmt w:val="bullet"/>
+      <w:lvlText w:val=""/>
+      <w:lvlJc w:val="left"/>
+      <w:pPr>
+        <w:ind w:left="2160" w:hanging="360"/>
+      </w:pPr>
+      <w:rPr>
+        <w:rFonts w:ascii="Wingdings" w:hAnsi="Wingdings" w:hint="default"/>
+      </w:rPr>
+    </w:lvl>
+    <w:lvl w:ilvl="3" w:tplc="340A0001" w:tentative="1">
+      <w:start w:val="1"/>
+      <w:numFmt w:val="bullet"/>
+      <w:lvlText w:val=""/>
+      <w:lvlJc w:val="left"/>
+      <w:pPr>
+        <w:ind w:left="2880" w:hanging="360"/>
+      </w:pPr>
+      <w:rPr>
+        <w:rFonts w:ascii="Symbol" w:hAnsi="Symbol" w:hint="default"/>
+      </w:rPr>
+    </w:lvl>
+    <w:lvl w:ilvl="4" w:tplc="340A0003" w:tentative="1">
+      <w:start w:val="1"/>
+      <w:numFmt w:val="bullet"/>
+      <w:lvlText w:val="o"/>
+      <w:lvlJc w:val="left"/>
+      <w:pPr>
+        <w:ind w:left="3600" w:hanging="360"/>
+      </w:pPr>
+      <w:rPr>
+        <w:rFonts w:ascii="Courier New" w:hAnsi="Courier New" w:cs="Courier New" w:hint="default"/>
+      </w:rPr>
+    </w:lvl>
+    <w:lvl w:ilvl="5" w:tplc="340A0005" w:tentative="1">
+      <w:start w:val="1"/>
+      <w:numFmt w:val="bullet"/>
+      <w:lvlText w:val=""/>
+      <w:lvlJc w:val="left"/>
+      <w:pPr>
+        <w:ind w:left="4320" w:hanging="360"/>
+      </w:pPr>
+      <w:rPr>
+        <w:rFonts w:ascii="Wingdings" w:hAnsi="Wingdings" w:hint="default"/>
+      </w:rPr>
+    </w:lvl>
+    <w:lvl w:ilvl="6" w:tplc="340A0001" w:tentative="1">
+      <w:start w:val="1"/>
+      <w:numFmt w:val="bullet"/>
+      <w:lvlText w:val=""/>
+      <w:lvlJc w:val="left"/>
+      <w:pPr>
+        <w:ind w:left="5040" w:hanging="360"/>
+      </w:pPr>
+      <w:rPr>
+        <w:rFonts w:ascii="Symbol" w:hAnsi="Symbol" w:hint="default"/>
+      </w:rPr>
+    </w:lvl>
+    <w:lvl w:ilvl="7" w:tplc="340A0003" w:tentative="1">
+      <w:start w:val="1"/>
+      <w:numFmt w:val="bullet"/>
+      <w:lvlText w:val="o"/>
+      <w:lvlJc w:val="left"/>
+      <w:pPr>
+        <w:ind w:left="5760" w:hanging="360"/>
+      </w:pPr>
+      <w:rPr>
+        <w:rFonts w:ascii="Courier New" w:hAnsi="Courier New" w:cs="Courier New" w:hint="default"/>
+      </w:rPr>
+    </w:lvl>
+    <w:lvl w:ilvl="8" w:tplc="340A0005" w:tentative="1">
+      <w:start w:val="1"/>
+      <w:numFmt w:val="bullet"/>
+      <w:lvlText w:val=""/>
+      <w:lvlJc w:val="left"/>
+      <w:pPr>
+        <w:ind w:left="6480" w:hanging="360"/>
+      </w:pPr>
+      <w:rPr>
+        <w:rFonts w:ascii="Wingdings" w:hAnsi="Wingdings" w:hint="default"/>
+      </w:rPr>
+    </w:lvl>
+  </w:abstractNum>
+  <w:abstractNum w:abstractNumId="4" w15:restartNumberingAfterBreak="0">
     <w:nsid w:val="0A0A486E"/>
     <w:multiLevelType w:val="multilevel"/>
     <w:tmpl w:val="B396F806"/>
@@ -16848,7 +17414,7 @@
       </w:rPr>
     </w:lvl>
   </w:abstractNum>
-  <w:abstractNum w:abstractNumId="2" w15:restartNumberingAfterBreak="0">
+  <w:abstractNum w:abstractNumId="5" w15:restartNumberingAfterBreak="0">
     <w:nsid w:val="14571403"/>
     <w:multiLevelType w:val="multilevel"/>
     <w:tmpl w:val="F4506644"/>
@@ -17069,7 +17635,7 @@
       </w:rPr>
     </w:lvl>
   </w:abstractNum>
-  <w:abstractNum w:abstractNumId="3" w15:restartNumberingAfterBreak="0">
+  <w:abstractNum w:abstractNumId="6" w15:restartNumberingAfterBreak="0">
     <w:nsid w:val="1DCA0DC9"/>
     <w:multiLevelType w:val="multilevel"/>
     <w:tmpl w:val="1C52DE42"/>
@@ -17290,7 +17856,233 @@
       </w:rPr>
     </w:lvl>
   </w:abstractNum>
-  <w:abstractNum w:abstractNumId="4" w15:restartNumberingAfterBreak="0">
+  <w:abstractNum w:abstractNumId="7" w15:restartNumberingAfterBreak="0">
+    <w:nsid w:val="209B00C0"/>
+    <w:multiLevelType w:val="hybridMultilevel"/>
+    <w:tmpl w:val="ECA05530"/>
+    <w:lvl w:ilvl="0" w:tplc="340A0001">
+      <w:start w:val="1"/>
+      <w:numFmt w:val="bullet"/>
+      <w:lvlText w:val=""/>
+      <w:lvlJc w:val="left"/>
+      <w:pPr>
+        <w:ind w:left="720" w:hanging="360"/>
+      </w:pPr>
+      <w:rPr>
+        <w:rFonts w:ascii="Symbol" w:hAnsi="Symbol" w:hint="default"/>
+      </w:rPr>
+    </w:lvl>
+    <w:lvl w:ilvl="1" w:tplc="FFFFFFFF" w:tentative="1">
+      <w:start w:val="1"/>
+      <w:numFmt w:val="bullet"/>
+      <w:lvlText w:val="o"/>
+      <w:lvlJc w:val="left"/>
+      <w:pPr>
+        <w:ind w:left="1440" w:hanging="360"/>
+      </w:pPr>
+      <w:rPr>
+        <w:rFonts w:ascii="Courier New" w:hAnsi="Courier New" w:cs="Courier New" w:hint="default"/>
+      </w:rPr>
+    </w:lvl>
+    <w:lvl w:ilvl="2" w:tplc="FFFFFFFF" w:tentative="1">
+      <w:start w:val="1"/>
+      <w:numFmt w:val="bullet"/>
+      <w:lvlText w:val=""/>
+      <w:lvlJc w:val="left"/>
+      <w:pPr>
+        <w:ind w:left="2160" w:hanging="360"/>
+      </w:pPr>
+      <w:rPr>
+        <w:rFonts w:ascii="Wingdings" w:hAnsi="Wingdings" w:hint="default"/>
+      </w:rPr>
+    </w:lvl>
+    <w:lvl w:ilvl="3" w:tplc="FFFFFFFF" w:tentative="1">
+      <w:start w:val="1"/>
+      <w:numFmt w:val="bullet"/>
+      <w:lvlText w:val=""/>
+      <w:lvlJc w:val="left"/>
+      <w:pPr>
+        <w:ind w:left="2880" w:hanging="360"/>
+      </w:pPr>
+      <w:rPr>
+        <w:rFonts w:ascii="Symbol" w:hAnsi="Symbol" w:hint="default"/>
+      </w:rPr>
+    </w:lvl>
+    <w:lvl w:ilvl="4" w:tplc="FFFFFFFF" w:tentative="1">
+      <w:start w:val="1"/>
+      <w:numFmt w:val="bullet"/>
+      <w:lvlText w:val="o"/>
+      <w:lvlJc w:val="left"/>
+      <w:pPr>
+        <w:ind w:left="3600" w:hanging="360"/>
+      </w:pPr>
+      <w:rPr>
+        <w:rFonts w:ascii="Courier New" w:hAnsi="Courier New" w:cs="Courier New" w:hint="default"/>
+      </w:rPr>
+    </w:lvl>
+    <w:lvl w:ilvl="5" w:tplc="FFFFFFFF" w:tentative="1">
+      <w:start w:val="1"/>
+      <w:numFmt w:val="bullet"/>
+      <w:lvlText w:val=""/>
+      <w:lvlJc w:val="left"/>
+      <w:pPr>
+        <w:ind w:left="4320" w:hanging="360"/>
+      </w:pPr>
+      <w:rPr>
+        <w:rFonts w:ascii="Wingdings" w:hAnsi="Wingdings" w:hint="default"/>
+      </w:rPr>
+    </w:lvl>
+    <w:lvl w:ilvl="6" w:tplc="FFFFFFFF" w:tentative="1">
+      <w:start w:val="1"/>
+      <w:numFmt w:val="bullet"/>
+      <w:lvlText w:val=""/>
+      <w:lvlJc w:val="left"/>
+      <w:pPr>
+        <w:ind w:left="5040" w:hanging="360"/>
+      </w:pPr>
+      <w:rPr>
+        <w:rFonts w:ascii="Symbol" w:hAnsi="Symbol" w:hint="default"/>
+      </w:rPr>
+    </w:lvl>
+    <w:lvl w:ilvl="7" w:tplc="FFFFFFFF" w:tentative="1">
+      <w:start w:val="1"/>
+      <w:numFmt w:val="bullet"/>
+      <w:lvlText w:val="o"/>
+      <w:lvlJc w:val="left"/>
+      <w:pPr>
+        <w:ind w:left="5760" w:hanging="360"/>
+      </w:pPr>
+      <w:rPr>
+        <w:rFonts w:ascii="Courier New" w:hAnsi="Courier New" w:cs="Courier New" w:hint="default"/>
+      </w:rPr>
+    </w:lvl>
+    <w:lvl w:ilvl="8" w:tplc="FFFFFFFF" w:tentative="1">
+      <w:start w:val="1"/>
+      <w:numFmt w:val="bullet"/>
+      <w:lvlText w:val=""/>
+      <w:lvlJc w:val="left"/>
+      <w:pPr>
+        <w:ind w:left="6480" w:hanging="360"/>
+      </w:pPr>
+      <w:rPr>
+        <w:rFonts w:ascii="Wingdings" w:hAnsi="Wingdings" w:hint="default"/>
+      </w:rPr>
+    </w:lvl>
+  </w:abstractNum>
+  <w:abstractNum w:abstractNumId="8" w15:restartNumberingAfterBreak="0">
+    <w:nsid w:val="258D38D6"/>
+    <w:multiLevelType w:val="hybridMultilevel"/>
+    <w:tmpl w:val="3336E662"/>
+    <w:lvl w:ilvl="0" w:tplc="340A0001">
+      <w:start w:val="1"/>
+      <w:numFmt w:val="bullet"/>
+      <w:lvlText w:val=""/>
+      <w:lvlJc w:val="left"/>
+      <w:pPr>
+        <w:ind w:left="660" w:hanging="360"/>
+      </w:pPr>
+      <w:rPr>
+        <w:rFonts w:ascii="Symbol" w:hAnsi="Symbol" w:hint="default"/>
+      </w:rPr>
+    </w:lvl>
+    <w:lvl w:ilvl="1" w:tplc="340A0003" w:tentative="1">
+      <w:start w:val="1"/>
+      <w:numFmt w:val="bullet"/>
+      <w:lvlText w:val="o"/>
+      <w:lvlJc w:val="left"/>
+      <w:pPr>
+        <w:ind w:left="1380" w:hanging="360"/>
+      </w:pPr>
+      <w:rPr>
+        <w:rFonts w:ascii="Courier New" w:hAnsi="Courier New" w:cs="Courier New" w:hint="default"/>
+      </w:rPr>
+    </w:lvl>
+    <w:lvl w:ilvl="2" w:tplc="340A0005" w:tentative="1">
+      <w:start w:val="1"/>
+      <w:numFmt w:val="bullet"/>
+      <w:lvlText w:val=""/>
+      <w:lvlJc w:val="left"/>
+      <w:pPr>
+        <w:ind w:left="2100" w:hanging="360"/>
+      </w:pPr>
+      <w:rPr>
+        <w:rFonts w:ascii="Wingdings" w:hAnsi="Wingdings" w:hint="default"/>
+      </w:rPr>
+    </w:lvl>
+    <w:lvl w:ilvl="3" w:tplc="340A0001" w:tentative="1">
+      <w:start w:val="1"/>
+      <w:numFmt w:val="bullet"/>
+      <w:lvlText w:val=""/>
+      <w:lvlJc w:val="left"/>
+      <w:pPr>
+        <w:ind w:left="2820" w:hanging="360"/>
+      </w:pPr>
+      <w:rPr>
+        <w:rFonts w:ascii="Symbol" w:hAnsi="Symbol" w:hint="default"/>
+      </w:rPr>
+    </w:lvl>
+    <w:lvl w:ilvl="4" w:tplc="340A0003" w:tentative="1">
+      <w:start w:val="1"/>
+      <w:numFmt w:val="bullet"/>
+      <w:lvlText w:val="o"/>
+      <w:lvlJc w:val="left"/>
+      <w:pPr>
+        <w:ind w:left="3540" w:hanging="360"/>
+      </w:pPr>
+      <w:rPr>
+        <w:rFonts w:ascii="Courier New" w:hAnsi="Courier New" w:cs="Courier New" w:hint="default"/>
+      </w:rPr>
+    </w:lvl>
+    <w:lvl w:ilvl="5" w:tplc="340A0005" w:tentative="1">
+      <w:start w:val="1"/>
+      <w:numFmt w:val="bullet"/>
+      <w:lvlText w:val=""/>
+      <w:lvlJc w:val="left"/>
+      <w:pPr>
+        <w:ind w:left="4260" w:hanging="360"/>
+      </w:pPr>
+      <w:rPr>
+        <w:rFonts w:ascii="Wingdings" w:hAnsi="Wingdings" w:hint="default"/>
+      </w:rPr>
+    </w:lvl>
+    <w:lvl w:ilvl="6" w:tplc="340A0001" w:tentative="1">
+      <w:start w:val="1"/>
+      <w:numFmt w:val="bullet"/>
+      <w:lvlText w:val=""/>
+      <w:lvlJc w:val="left"/>
+      <w:pPr>
+        <w:ind w:left="4980" w:hanging="360"/>
+      </w:pPr>
+      <w:rPr>
+        <w:rFonts w:ascii="Symbol" w:hAnsi="Symbol" w:hint="default"/>
+      </w:rPr>
+    </w:lvl>
+    <w:lvl w:ilvl="7" w:tplc="340A0003" w:tentative="1">
+      <w:start w:val="1"/>
+      <w:numFmt w:val="bullet"/>
+      <w:lvlText w:val="o"/>
+      <w:lvlJc w:val="left"/>
+      <w:pPr>
+        <w:ind w:left="5700" w:hanging="360"/>
+      </w:pPr>
+      <w:rPr>
+        <w:rFonts w:ascii="Courier New" w:hAnsi="Courier New" w:cs="Courier New" w:hint="default"/>
+      </w:rPr>
+    </w:lvl>
+    <w:lvl w:ilvl="8" w:tplc="340A0005" w:tentative="1">
+      <w:start w:val="1"/>
+      <w:numFmt w:val="bullet"/>
+      <w:lvlText w:val=""/>
+      <w:lvlJc w:val="left"/>
+      <w:pPr>
+        <w:ind w:left="6420" w:hanging="360"/>
+      </w:pPr>
+      <w:rPr>
+        <w:rFonts w:ascii="Wingdings" w:hAnsi="Wingdings" w:hint="default"/>
+      </w:rPr>
+    </w:lvl>
+  </w:abstractNum>
+  <w:abstractNum w:abstractNumId="9" w15:restartNumberingAfterBreak="0">
     <w:nsid w:val="33AF77F7"/>
     <w:multiLevelType w:val="multilevel"/>
     <w:tmpl w:val="B56CA3C2"/>
@@ -17511,7 +18303,7 @@
       </w:rPr>
     </w:lvl>
   </w:abstractNum>
-  <w:abstractNum w:abstractNumId="5" w15:restartNumberingAfterBreak="0">
+  <w:abstractNum w:abstractNumId="10" w15:restartNumberingAfterBreak="0">
     <w:nsid w:val="40FD5CDA"/>
     <w:multiLevelType w:val="multilevel"/>
     <w:tmpl w:val="C65AE1EE"/>
@@ -17732,7 +18524,7 @@
       </w:rPr>
     </w:lvl>
   </w:abstractNum>
-  <w:abstractNum w:abstractNumId="6" w15:restartNumberingAfterBreak="0">
+  <w:abstractNum w:abstractNumId="11" w15:restartNumberingAfterBreak="0">
     <w:nsid w:val="41C3086B"/>
     <w:multiLevelType w:val="multilevel"/>
     <w:tmpl w:val="40763A66"/>
@@ -17881,7 +18673,7 @@
       </w:rPr>
     </w:lvl>
   </w:abstractNum>
-  <w:abstractNum w:abstractNumId="7" w15:restartNumberingAfterBreak="0">
+  <w:abstractNum w:abstractNumId="12" w15:restartNumberingAfterBreak="0">
     <w:nsid w:val="46723D7A"/>
     <w:multiLevelType w:val="multilevel"/>
     <w:tmpl w:val="6444234C"/>
@@ -18102,7 +18894,7 @@
       </w:rPr>
     </w:lvl>
   </w:abstractNum>
-  <w:abstractNum w:abstractNumId="8" w15:restartNumberingAfterBreak="0">
+  <w:abstractNum w:abstractNumId="13" w15:restartNumberingAfterBreak="0">
     <w:nsid w:val="48C333F1"/>
     <w:multiLevelType w:val="multilevel"/>
     <w:tmpl w:val="AC62C4A2"/>
@@ -18251,7 +19043,346 @@
       </w:rPr>
     </w:lvl>
   </w:abstractNum>
-  <w:abstractNum w:abstractNumId="9" w15:restartNumberingAfterBreak="0">
+  <w:abstractNum w:abstractNumId="14" w15:restartNumberingAfterBreak="0">
+    <w:nsid w:val="49E81F23"/>
+    <w:multiLevelType w:val="hybridMultilevel"/>
+    <w:tmpl w:val="6B2E2FB2"/>
+    <w:lvl w:ilvl="0" w:tplc="340A0001">
+      <w:start w:val="1"/>
+      <w:numFmt w:val="bullet"/>
+      <w:lvlText w:val=""/>
+      <w:lvlJc w:val="left"/>
+      <w:pPr>
+        <w:ind w:left="720" w:hanging="360"/>
+      </w:pPr>
+      <w:rPr>
+        <w:rFonts w:ascii="Symbol" w:hAnsi="Symbol" w:hint="default"/>
+      </w:rPr>
+    </w:lvl>
+    <w:lvl w:ilvl="1" w:tplc="340A0003" w:tentative="1">
+      <w:start w:val="1"/>
+      <w:numFmt w:val="bullet"/>
+      <w:lvlText w:val="o"/>
+      <w:lvlJc w:val="left"/>
+      <w:pPr>
+        <w:ind w:left="1440" w:hanging="360"/>
+      </w:pPr>
+      <w:rPr>
+        <w:rFonts w:ascii="Courier New" w:hAnsi="Courier New" w:cs="Courier New" w:hint="default"/>
+      </w:rPr>
+    </w:lvl>
+    <w:lvl w:ilvl="2" w:tplc="340A0005" w:tentative="1">
+      <w:start w:val="1"/>
+      <w:numFmt w:val="bullet"/>
+      <w:lvlText w:val=""/>
+      <w:lvlJc w:val="left"/>
+      <w:pPr>
+        <w:ind w:left="2160" w:hanging="360"/>
+      </w:pPr>
+      <w:rPr>
+        <w:rFonts w:ascii="Wingdings" w:hAnsi="Wingdings" w:hint="default"/>
+      </w:rPr>
+    </w:lvl>
+    <w:lvl w:ilvl="3" w:tplc="340A0001" w:tentative="1">
+      <w:start w:val="1"/>
+      <w:numFmt w:val="bullet"/>
+      <w:lvlText w:val=""/>
+      <w:lvlJc w:val="left"/>
+      <w:pPr>
+        <w:ind w:left="2880" w:hanging="360"/>
+      </w:pPr>
+      <w:rPr>
+        <w:rFonts w:ascii="Symbol" w:hAnsi="Symbol" w:hint="default"/>
+      </w:rPr>
+    </w:lvl>
+    <w:lvl w:ilvl="4" w:tplc="340A0003" w:tentative="1">
+      <w:start w:val="1"/>
+      <w:numFmt w:val="bullet"/>
+      <w:lvlText w:val="o"/>
+      <w:lvlJc w:val="left"/>
+      <w:pPr>
+        <w:ind w:left="3600" w:hanging="360"/>
+      </w:pPr>
+      <w:rPr>
+        <w:rFonts w:ascii="Courier New" w:hAnsi="Courier New" w:cs="Courier New" w:hint="default"/>
+      </w:rPr>
+    </w:lvl>
+    <w:lvl w:ilvl="5" w:tplc="340A0005" w:tentative="1">
+      <w:start w:val="1"/>
+      <w:numFmt w:val="bullet"/>
+      <w:lvlText w:val=""/>
+      <w:lvlJc w:val="left"/>
+      <w:pPr>
+        <w:ind w:left="4320" w:hanging="360"/>
+      </w:pPr>
+      <w:rPr>
+        <w:rFonts w:ascii="Wingdings" w:hAnsi="Wingdings" w:hint="default"/>
+      </w:rPr>
+    </w:lvl>
+    <w:lvl w:ilvl="6" w:tplc="340A0001" w:tentative="1">
+      <w:start w:val="1"/>
+      <w:numFmt w:val="bullet"/>
+      <w:lvlText w:val=""/>
+      <w:lvlJc w:val="left"/>
+      <w:pPr>
+        <w:ind w:left="5040" w:hanging="360"/>
+      </w:pPr>
+      <w:rPr>
+        <w:rFonts w:ascii="Symbol" w:hAnsi="Symbol" w:hint="default"/>
+      </w:rPr>
+    </w:lvl>
+    <w:lvl w:ilvl="7" w:tplc="340A0003" w:tentative="1">
+      <w:start w:val="1"/>
+      <w:numFmt w:val="bullet"/>
+      <w:lvlText w:val="o"/>
+      <w:lvlJc w:val="left"/>
+      <w:pPr>
+        <w:ind w:left="5760" w:hanging="360"/>
+      </w:pPr>
+      <w:rPr>
+        <w:rFonts w:ascii="Courier New" w:hAnsi="Courier New" w:cs="Courier New" w:hint="default"/>
+      </w:rPr>
+    </w:lvl>
+    <w:lvl w:ilvl="8" w:tplc="340A0005" w:tentative="1">
+      <w:start w:val="1"/>
+      <w:numFmt w:val="bullet"/>
+      <w:lvlText w:val=""/>
+      <w:lvlJc w:val="left"/>
+      <w:pPr>
+        <w:ind w:left="6480" w:hanging="360"/>
+      </w:pPr>
+      <w:rPr>
+        <w:rFonts w:ascii="Wingdings" w:hAnsi="Wingdings" w:hint="default"/>
+      </w:rPr>
+    </w:lvl>
+  </w:abstractNum>
+  <w:abstractNum w:abstractNumId="15" w15:restartNumberingAfterBreak="0">
+    <w:nsid w:val="4B362C43"/>
+    <w:multiLevelType w:val="hybridMultilevel"/>
+    <w:tmpl w:val="9C1EB16C"/>
+    <w:lvl w:ilvl="0" w:tplc="340A0001">
+      <w:start w:val="1"/>
+      <w:numFmt w:val="bullet"/>
+      <w:lvlText w:val=""/>
+      <w:lvlJc w:val="left"/>
+      <w:pPr>
+        <w:ind w:left="720" w:hanging="360"/>
+      </w:pPr>
+      <w:rPr>
+        <w:rFonts w:ascii="Symbol" w:hAnsi="Symbol" w:hint="default"/>
+      </w:rPr>
+    </w:lvl>
+    <w:lvl w:ilvl="1" w:tplc="340A0003" w:tentative="1">
+      <w:start w:val="1"/>
+      <w:numFmt w:val="bullet"/>
+      <w:lvlText w:val="o"/>
+      <w:lvlJc w:val="left"/>
+      <w:pPr>
+        <w:ind w:left="1440" w:hanging="360"/>
+      </w:pPr>
+      <w:rPr>
+        <w:rFonts w:ascii="Courier New" w:hAnsi="Courier New" w:cs="Courier New" w:hint="default"/>
+      </w:rPr>
+    </w:lvl>
+    <w:lvl w:ilvl="2" w:tplc="340A0005" w:tentative="1">
+      <w:start w:val="1"/>
+      <w:numFmt w:val="bullet"/>
+      <w:lvlText w:val=""/>
+      <w:lvlJc w:val="left"/>
+      <w:pPr>
+        <w:ind w:left="2160" w:hanging="360"/>
+      </w:pPr>
+      <w:rPr>
+        <w:rFonts w:ascii="Wingdings" w:hAnsi="Wingdings" w:hint="default"/>
+      </w:rPr>
+    </w:lvl>
+    <w:lvl w:ilvl="3" w:tplc="340A0001" w:tentative="1">
+      <w:start w:val="1"/>
+      <w:numFmt w:val="bullet"/>
+      <w:lvlText w:val=""/>
+      <w:lvlJc w:val="left"/>
+      <w:pPr>
+        <w:ind w:left="2880" w:hanging="360"/>
+      </w:pPr>
+      <w:rPr>
+        <w:rFonts w:ascii="Symbol" w:hAnsi="Symbol" w:hint="default"/>
+      </w:rPr>
+    </w:lvl>
+    <w:lvl w:ilvl="4" w:tplc="340A0003" w:tentative="1">
+      <w:start w:val="1"/>
+      <w:numFmt w:val="bullet"/>
+      <w:lvlText w:val="o"/>
+      <w:lvlJc w:val="left"/>
+      <w:pPr>
+        <w:ind w:left="3600" w:hanging="360"/>
+      </w:pPr>
+      <w:rPr>
+        <w:rFonts w:ascii="Courier New" w:hAnsi="Courier New" w:cs="Courier New" w:hint="default"/>
+      </w:rPr>
+    </w:lvl>
+    <w:lvl w:ilvl="5" w:tplc="340A0005" w:tentative="1">
+      <w:start w:val="1"/>
+      <w:numFmt w:val="bullet"/>
+      <w:lvlText w:val=""/>
+      <w:lvlJc w:val="left"/>
+      <w:pPr>
+        <w:ind w:left="4320" w:hanging="360"/>
+      </w:pPr>
+      <w:rPr>
+        <w:rFonts w:ascii="Wingdings" w:hAnsi="Wingdings" w:hint="default"/>
+      </w:rPr>
+    </w:lvl>
+    <w:lvl w:ilvl="6" w:tplc="340A0001" w:tentative="1">
+      <w:start w:val="1"/>
+      <w:numFmt w:val="bullet"/>
+      <w:lvlText w:val=""/>
+      <w:lvlJc w:val="left"/>
+      <w:pPr>
+        <w:ind w:left="5040" w:hanging="360"/>
+      </w:pPr>
+      <w:rPr>
+        <w:rFonts w:ascii="Symbol" w:hAnsi="Symbol" w:hint="default"/>
+      </w:rPr>
+    </w:lvl>
+    <w:lvl w:ilvl="7" w:tplc="340A0003" w:tentative="1">
+      <w:start w:val="1"/>
+      <w:numFmt w:val="bullet"/>
+      <w:lvlText w:val="o"/>
+      <w:lvlJc w:val="left"/>
+      <w:pPr>
+        <w:ind w:left="5760" w:hanging="360"/>
+      </w:pPr>
+      <w:rPr>
+        <w:rFonts w:ascii="Courier New" w:hAnsi="Courier New" w:cs="Courier New" w:hint="default"/>
+      </w:rPr>
+    </w:lvl>
+    <w:lvl w:ilvl="8" w:tplc="340A0005" w:tentative="1">
+      <w:start w:val="1"/>
+      <w:numFmt w:val="bullet"/>
+      <w:lvlText w:val=""/>
+      <w:lvlJc w:val="left"/>
+      <w:pPr>
+        <w:ind w:left="6480" w:hanging="360"/>
+      </w:pPr>
+      <w:rPr>
+        <w:rFonts w:ascii="Wingdings" w:hAnsi="Wingdings" w:hint="default"/>
+      </w:rPr>
+    </w:lvl>
+  </w:abstractNum>
+  <w:abstractNum w:abstractNumId="16" w15:restartNumberingAfterBreak="0">
+    <w:nsid w:val="571C063E"/>
+    <w:multiLevelType w:val="hybridMultilevel"/>
+    <w:tmpl w:val="32B0E2E2"/>
+    <w:lvl w:ilvl="0" w:tplc="340A0001">
+      <w:start w:val="1"/>
+      <w:numFmt w:val="bullet"/>
+      <w:lvlText w:val=""/>
+      <w:lvlJc w:val="left"/>
+      <w:pPr>
+        <w:ind w:left="1080" w:hanging="360"/>
+      </w:pPr>
+      <w:rPr>
+        <w:rFonts w:ascii="Symbol" w:hAnsi="Symbol" w:hint="default"/>
+      </w:rPr>
+    </w:lvl>
+    <w:lvl w:ilvl="1" w:tplc="340A0003" w:tentative="1">
+      <w:start w:val="1"/>
+      <w:numFmt w:val="bullet"/>
+      <w:lvlText w:val="o"/>
+      <w:lvlJc w:val="left"/>
+      <w:pPr>
+        <w:ind w:left="1800" w:hanging="360"/>
+      </w:pPr>
+      <w:rPr>
+        <w:rFonts w:ascii="Courier New" w:hAnsi="Courier New" w:cs="Courier New" w:hint="default"/>
+      </w:rPr>
+    </w:lvl>
+    <w:lvl w:ilvl="2" w:tplc="340A0005" w:tentative="1">
+      <w:start w:val="1"/>
+      <w:numFmt w:val="bullet"/>
+      <w:lvlText w:val=""/>
+      <w:lvlJc w:val="left"/>
+      <w:pPr>
+        <w:ind w:left="2520" w:hanging="360"/>
+      </w:pPr>
+      <w:rPr>
+        <w:rFonts w:ascii="Wingdings" w:hAnsi="Wingdings" w:hint="default"/>
+      </w:rPr>
+    </w:lvl>
+    <w:lvl w:ilvl="3" w:tplc="340A0001" w:tentative="1">
+      <w:start w:val="1"/>
+      <w:numFmt w:val="bullet"/>
+      <w:lvlText w:val=""/>
+      <w:lvlJc w:val="left"/>
+      <w:pPr>
+        <w:ind w:left="3240" w:hanging="360"/>
+      </w:pPr>
+      <w:rPr>
+        <w:rFonts w:ascii="Symbol" w:hAnsi="Symbol" w:hint="default"/>
+      </w:rPr>
+    </w:lvl>
+    <w:lvl w:ilvl="4" w:tplc="340A0003" w:tentative="1">
+      <w:start w:val="1"/>
+      <w:numFmt w:val="bullet"/>
+      <w:lvlText w:val="o"/>
+      <w:lvlJc w:val="left"/>
+      <w:pPr>
+        <w:ind w:left="3960" w:hanging="360"/>
+      </w:pPr>
+      <w:rPr>
+        <w:rFonts w:ascii="Courier New" w:hAnsi="Courier New" w:cs="Courier New" w:hint="default"/>
+      </w:rPr>
+    </w:lvl>
+    <w:lvl w:ilvl="5" w:tplc="340A0005" w:tentative="1">
+      <w:start w:val="1"/>
+      <w:numFmt w:val="bullet"/>
+      <w:lvlText w:val=""/>
+      <w:lvlJc w:val="left"/>
+      <w:pPr>
+        <w:ind w:left="4680" w:hanging="360"/>
+      </w:pPr>
+      <w:rPr>
+        <w:rFonts w:ascii="Wingdings" w:hAnsi="Wingdings" w:hint="default"/>
+      </w:rPr>
+    </w:lvl>
+    <w:lvl w:ilvl="6" w:tplc="340A0001" w:tentative="1">
+      <w:start w:val="1"/>
+      <w:numFmt w:val="bullet"/>
+      <w:lvlText w:val=""/>
+      <w:lvlJc w:val="left"/>
+      <w:pPr>
+        <w:ind w:left="5400" w:hanging="360"/>
+      </w:pPr>
+      <w:rPr>
+        <w:rFonts w:ascii="Symbol" w:hAnsi="Symbol" w:hint="default"/>
+      </w:rPr>
+    </w:lvl>
+    <w:lvl w:ilvl="7" w:tplc="340A0003" w:tentative="1">
+      <w:start w:val="1"/>
+      <w:numFmt w:val="bullet"/>
+      <w:lvlText w:val="o"/>
+      <w:lvlJc w:val="left"/>
+      <w:pPr>
+        <w:ind w:left="6120" w:hanging="360"/>
+      </w:pPr>
+      <w:rPr>
+        <w:rFonts w:ascii="Courier New" w:hAnsi="Courier New" w:cs="Courier New" w:hint="default"/>
+      </w:rPr>
+    </w:lvl>
+    <w:lvl w:ilvl="8" w:tplc="340A0005" w:tentative="1">
+      <w:start w:val="1"/>
+      <w:numFmt w:val="bullet"/>
+      <w:lvlText w:val=""/>
+      <w:lvlJc w:val="left"/>
+      <w:pPr>
+        <w:ind w:left="6840" w:hanging="360"/>
+      </w:pPr>
+      <w:rPr>
+        <w:rFonts w:ascii="Wingdings" w:hAnsi="Wingdings" w:hint="default"/>
+      </w:rPr>
+    </w:lvl>
+  </w:abstractNum>
+  <w:abstractNum w:abstractNumId="17" w15:restartNumberingAfterBreak="0">
     <w:nsid w:val="57995B2A"/>
     <w:multiLevelType w:val="multilevel"/>
     <w:tmpl w:val="6A9EB0FC"/>
@@ -18400,7 +19531,459 @@
       </w:rPr>
     </w:lvl>
   </w:abstractNum>
-  <w:abstractNum w:abstractNumId="10" w15:restartNumberingAfterBreak="0">
+  <w:abstractNum w:abstractNumId="18" w15:restartNumberingAfterBreak="0">
+    <w:nsid w:val="58C95E02"/>
+    <w:multiLevelType w:val="hybridMultilevel"/>
+    <w:tmpl w:val="67E09456"/>
+    <w:lvl w:ilvl="0" w:tplc="340A0001">
+      <w:start w:val="1"/>
+      <w:numFmt w:val="bullet"/>
+      <w:lvlText w:val=""/>
+      <w:lvlJc w:val="left"/>
+      <w:pPr>
+        <w:ind w:left="660" w:hanging="360"/>
+      </w:pPr>
+      <w:rPr>
+        <w:rFonts w:ascii="Symbol" w:hAnsi="Symbol" w:hint="default"/>
+      </w:rPr>
+    </w:lvl>
+    <w:lvl w:ilvl="1" w:tplc="340A0003" w:tentative="1">
+      <w:start w:val="1"/>
+      <w:numFmt w:val="bullet"/>
+      <w:lvlText w:val="o"/>
+      <w:lvlJc w:val="left"/>
+      <w:pPr>
+        <w:ind w:left="1380" w:hanging="360"/>
+      </w:pPr>
+      <w:rPr>
+        <w:rFonts w:ascii="Courier New" w:hAnsi="Courier New" w:cs="Courier New" w:hint="default"/>
+      </w:rPr>
+    </w:lvl>
+    <w:lvl w:ilvl="2" w:tplc="340A0005" w:tentative="1">
+      <w:start w:val="1"/>
+      <w:numFmt w:val="bullet"/>
+      <w:lvlText w:val=""/>
+      <w:lvlJc w:val="left"/>
+      <w:pPr>
+        <w:ind w:left="2100" w:hanging="360"/>
+      </w:pPr>
+      <w:rPr>
+        <w:rFonts w:ascii="Wingdings" w:hAnsi="Wingdings" w:hint="default"/>
+      </w:rPr>
+    </w:lvl>
+    <w:lvl w:ilvl="3" w:tplc="340A0001" w:tentative="1">
+      <w:start w:val="1"/>
+      <w:numFmt w:val="bullet"/>
+      <w:lvlText w:val=""/>
+      <w:lvlJc w:val="left"/>
+      <w:pPr>
+        <w:ind w:left="2820" w:hanging="360"/>
+      </w:pPr>
+      <w:rPr>
+        <w:rFonts w:ascii="Symbol" w:hAnsi="Symbol" w:hint="default"/>
+      </w:rPr>
+    </w:lvl>
+    <w:lvl w:ilvl="4" w:tplc="340A0003" w:tentative="1">
+      <w:start w:val="1"/>
+      <w:numFmt w:val="bullet"/>
+      <w:lvlText w:val="o"/>
+      <w:lvlJc w:val="left"/>
+      <w:pPr>
+        <w:ind w:left="3540" w:hanging="360"/>
+      </w:pPr>
+      <w:rPr>
+        <w:rFonts w:ascii="Courier New" w:hAnsi="Courier New" w:cs="Courier New" w:hint="default"/>
+      </w:rPr>
+    </w:lvl>
+    <w:lvl w:ilvl="5" w:tplc="340A0005" w:tentative="1">
+      <w:start w:val="1"/>
+      <w:numFmt w:val="bullet"/>
+      <w:lvlText w:val=""/>
+      <w:lvlJc w:val="left"/>
+      <w:pPr>
+        <w:ind w:left="4260" w:hanging="360"/>
+      </w:pPr>
+      <w:rPr>
+        <w:rFonts w:ascii="Wingdings" w:hAnsi="Wingdings" w:hint="default"/>
+      </w:rPr>
+    </w:lvl>
+    <w:lvl w:ilvl="6" w:tplc="340A0001" w:tentative="1">
+      <w:start w:val="1"/>
+      <w:numFmt w:val="bullet"/>
+      <w:lvlText w:val=""/>
+      <w:lvlJc w:val="left"/>
+      <w:pPr>
+        <w:ind w:left="4980" w:hanging="360"/>
+      </w:pPr>
+      <w:rPr>
+        <w:rFonts w:ascii="Symbol" w:hAnsi="Symbol" w:hint="default"/>
+      </w:rPr>
+    </w:lvl>
+    <w:lvl w:ilvl="7" w:tplc="340A0003" w:tentative="1">
+      <w:start w:val="1"/>
+      <w:numFmt w:val="bullet"/>
+      <w:lvlText w:val="o"/>
+      <w:lvlJc w:val="left"/>
+      <w:pPr>
+        <w:ind w:left="5700" w:hanging="360"/>
+      </w:pPr>
+      <w:rPr>
+        <w:rFonts w:ascii="Courier New" w:hAnsi="Courier New" w:cs="Courier New" w:hint="default"/>
+      </w:rPr>
+    </w:lvl>
+    <w:lvl w:ilvl="8" w:tplc="340A0005" w:tentative="1">
+      <w:start w:val="1"/>
+      <w:numFmt w:val="bullet"/>
+      <w:lvlText w:val=""/>
+      <w:lvlJc w:val="left"/>
+      <w:pPr>
+        <w:ind w:left="6420" w:hanging="360"/>
+      </w:pPr>
+      <w:rPr>
+        <w:rFonts w:ascii="Wingdings" w:hAnsi="Wingdings" w:hint="default"/>
+      </w:rPr>
+    </w:lvl>
+  </w:abstractNum>
+  <w:abstractNum w:abstractNumId="19" w15:restartNumberingAfterBreak="0">
+    <w:nsid w:val="663B26A8"/>
+    <w:multiLevelType w:val="hybridMultilevel"/>
+    <w:tmpl w:val="8E12CA22"/>
+    <w:lvl w:ilvl="0" w:tplc="340A0001">
+      <w:start w:val="1"/>
+      <w:numFmt w:val="bullet"/>
+      <w:lvlText w:val=""/>
+      <w:lvlJc w:val="left"/>
+      <w:pPr>
+        <w:ind w:left="1080" w:hanging="360"/>
+      </w:pPr>
+      <w:rPr>
+        <w:rFonts w:ascii="Symbol" w:hAnsi="Symbol" w:hint="default"/>
+      </w:rPr>
+    </w:lvl>
+    <w:lvl w:ilvl="1" w:tplc="340A0003" w:tentative="1">
+      <w:start w:val="1"/>
+      <w:numFmt w:val="bullet"/>
+      <w:lvlText w:val="o"/>
+      <w:lvlJc w:val="left"/>
+      <w:pPr>
+        <w:ind w:left="1800" w:hanging="360"/>
+      </w:pPr>
+      <w:rPr>
+        <w:rFonts w:ascii="Courier New" w:hAnsi="Courier New" w:cs="Courier New" w:hint="default"/>
+      </w:rPr>
+    </w:lvl>
+    <w:lvl w:ilvl="2" w:tplc="340A0005" w:tentative="1">
+      <w:start w:val="1"/>
+      <w:numFmt w:val="bullet"/>
+      <w:lvlText w:val=""/>
+      <w:lvlJc w:val="left"/>
+      <w:pPr>
+        <w:ind w:left="2520" w:hanging="360"/>
+      </w:pPr>
+      <w:rPr>
+        <w:rFonts w:ascii="Wingdings" w:hAnsi="Wingdings" w:hint="default"/>
+      </w:rPr>
+    </w:lvl>
+    <w:lvl w:ilvl="3" w:tplc="340A0001" w:tentative="1">
+      <w:start w:val="1"/>
+      <w:numFmt w:val="bullet"/>
+      <w:lvlText w:val=""/>
+      <w:lvlJc w:val="left"/>
+      <w:pPr>
+        <w:ind w:left="3240" w:hanging="360"/>
+      </w:pPr>
+      <w:rPr>
+        <w:rFonts w:ascii="Symbol" w:hAnsi="Symbol" w:hint="default"/>
+      </w:rPr>
+    </w:lvl>
+    <w:lvl w:ilvl="4" w:tplc="340A0003" w:tentative="1">
+      <w:start w:val="1"/>
+      <w:numFmt w:val="bullet"/>
+      <w:lvlText w:val="o"/>
+      <w:lvlJc w:val="left"/>
+      <w:pPr>
+        <w:ind w:left="3960" w:hanging="360"/>
+      </w:pPr>
+      <w:rPr>
+        <w:rFonts w:ascii="Courier New" w:hAnsi="Courier New" w:cs="Courier New" w:hint="default"/>
+      </w:rPr>
+    </w:lvl>
+    <w:lvl w:ilvl="5" w:tplc="340A0005" w:tentative="1">
+      <w:start w:val="1"/>
+      <w:numFmt w:val="bullet"/>
+      <w:lvlText w:val=""/>
+      <w:lvlJc w:val="left"/>
+      <w:pPr>
+        <w:ind w:left="4680" w:hanging="360"/>
+      </w:pPr>
+      <w:rPr>
+        <w:rFonts w:ascii="Wingdings" w:hAnsi="Wingdings" w:hint="default"/>
+      </w:rPr>
+    </w:lvl>
+    <w:lvl w:ilvl="6" w:tplc="340A0001" w:tentative="1">
+      <w:start w:val="1"/>
+      <w:numFmt w:val="bullet"/>
+      <w:lvlText w:val=""/>
+      <w:lvlJc w:val="left"/>
+      <w:pPr>
+        <w:ind w:left="5400" w:hanging="360"/>
+      </w:pPr>
+      <w:rPr>
+        <w:rFonts w:ascii="Symbol" w:hAnsi="Symbol" w:hint="default"/>
+      </w:rPr>
+    </w:lvl>
+    <w:lvl w:ilvl="7" w:tplc="340A0003" w:tentative="1">
+      <w:start w:val="1"/>
+      <w:numFmt w:val="bullet"/>
+      <w:lvlText w:val="o"/>
+      <w:lvlJc w:val="left"/>
+      <w:pPr>
+        <w:ind w:left="6120" w:hanging="360"/>
+      </w:pPr>
+      <w:rPr>
+        <w:rFonts w:ascii="Courier New" w:hAnsi="Courier New" w:cs="Courier New" w:hint="default"/>
+      </w:rPr>
+    </w:lvl>
+    <w:lvl w:ilvl="8" w:tplc="340A0005" w:tentative="1">
+      <w:start w:val="1"/>
+      <w:numFmt w:val="bullet"/>
+      <w:lvlText w:val=""/>
+      <w:lvlJc w:val="left"/>
+      <w:pPr>
+        <w:ind w:left="6840" w:hanging="360"/>
+      </w:pPr>
+      <w:rPr>
+        <w:rFonts w:ascii="Wingdings" w:hAnsi="Wingdings" w:hint="default"/>
+      </w:rPr>
+    </w:lvl>
+  </w:abstractNum>
+  <w:abstractNum w:abstractNumId="20" w15:restartNumberingAfterBreak="0">
+    <w:nsid w:val="70221A36"/>
+    <w:multiLevelType w:val="hybridMultilevel"/>
+    <w:tmpl w:val="6BB2EA0C"/>
+    <w:lvl w:ilvl="0" w:tplc="340A0001">
+      <w:start w:val="1"/>
+      <w:numFmt w:val="bullet"/>
+      <w:lvlText w:val=""/>
+      <w:lvlJc w:val="left"/>
+      <w:pPr>
+        <w:ind w:left="660" w:hanging="360"/>
+      </w:pPr>
+      <w:rPr>
+        <w:rFonts w:ascii="Symbol" w:hAnsi="Symbol" w:hint="default"/>
+      </w:rPr>
+    </w:lvl>
+    <w:lvl w:ilvl="1" w:tplc="340A0003" w:tentative="1">
+      <w:start w:val="1"/>
+      <w:numFmt w:val="bullet"/>
+      <w:lvlText w:val="o"/>
+      <w:lvlJc w:val="left"/>
+      <w:pPr>
+        <w:ind w:left="1380" w:hanging="360"/>
+      </w:pPr>
+      <w:rPr>
+        <w:rFonts w:ascii="Courier New" w:hAnsi="Courier New" w:cs="Courier New" w:hint="default"/>
+      </w:rPr>
+    </w:lvl>
+    <w:lvl w:ilvl="2" w:tplc="340A0005" w:tentative="1">
+      <w:start w:val="1"/>
+      <w:numFmt w:val="bullet"/>
+      <w:lvlText w:val=""/>
+      <w:lvlJc w:val="left"/>
+      <w:pPr>
+        <w:ind w:left="2100" w:hanging="360"/>
+      </w:pPr>
+      <w:rPr>
+        <w:rFonts w:ascii="Wingdings" w:hAnsi="Wingdings" w:hint="default"/>
+      </w:rPr>
+    </w:lvl>
+    <w:lvl w:ilvl="3" w:tplc="340A0001" w:tentative="1">
+      <w:start w:val="1"/>
+      <w:numFmt w:val="bullet"/>
+      <w:lvlText w:val=""/>
+      <w:lvlJc w:val="left"/>
+      <w:pPr>
+        <w:ind w:left="2820" w:hanging="360"/>
+      </w:pPr>
+      <w:rPr>
+        <w:rFonts w:ascii="Symbol" w:hAnsi="Symbol" w:hint="default"/>
+      </w:rPr>
+    </w:lvl>
+    <w:lvl w:ilvl="4" w:tplc="340A0003" w:tentative="1">
+      <w:start w:val="1"/>
+      <w:numFmt w:val="bullet"/>
+      <w:lvlText w:val="o"/>
+      <w:lvlJc w:val="left"/>
+      <w:pPr>
+        <w:ind w:left="3540" w:hanging="360"/>
+      </w:pPr>
+      <w:rPr>
+        <w:rFonts w:ascii="Courier New" w:hAnsi="Courier New" w:cs="Courier New" w:hint="default"/>
+      </w:rPr>
+    </w:lvl>
+    <w:lvl w:ilvl="5" w:tplc="340A0005" w:tentative="1">
+      <w:start w:val="1"/>
+      <w:numFmt w:val="bullet"/>
+      <w:lvlText w:val=""/>
+      <w:lvlJc w:val="left"/>
+      <w:pPr>
+        <w:ind w:left="4260" w:hanging="360"/>
+      </w:pPr>
+      <w:rPr>
+        <w:rFonts w:ascii="Wingdings" w:hAnsi="Wingdings" w:hint="default"/>
+      </w:rPr>
+    </w:lvl>
+    <w:lvl w:ilvl="6" w:tplc="340A0001" w:tentative="1">
+      <w:start w:val="1"/>
+      <w:numFmt w:val="bullet"/>
+      <w:lvlText w:val=""/>
+      <w:lvlJc w:val="left"/>
+      <w:pPr>
+        <w:ind w:left="4980" w:hanging="360"/>
+      </w:pPr>
+      <w:rPr>
+        <w:rFonts w:ascii="Symbol" w:hAnsi="Symbol" w:hint="default"/>
+      </w:rPr>
+    </w:lvl>
+    <w:lvl w:ilvl="7" w:tplc="340A0003" w:tentative="1">
+      <w:start w:val="1"/>
+      <w:numFmt w:val="bullet"/>
+      <w:lvlText w:val="o"/>
+      <w:lvlJc w:val="left"/>
+      <w:pPr>
+        <w:ind w:left="5700" w:hanging="360"/>
+      </w:pPr>
+      <w:rPr>
+        <w:rFonts w:ascii="Courier New" w:hAnsi="Courier New" w:cs="Courier New" w:hint="default"/>
+      </w:rPr>
+    </w:lvl>
+    <w:lvl w:ilvl="8" w:tplc="340A0005" w:tentative="1">
+      <w:start w:val="1"/>
+      <w:numFmt w:val="bullet"/>
+      <w:lvlText w:val=""/>
+      <w:lvlJc w:val="left"/>
+      <w:pPr>
+        <w:ind w:left="6420" w:hanging="360"/>
+      </w:pPr>
+      <w:rPr>
+        <w:rFonts w:ascii="Wingdings" w:hAnsi="Wingdings" w:hint="default"/>
+      </w:rPr>
+    </w:lvl>
+  </w:abstractNum>
+  <w:abstractNum w:abstractNumId="21" w15:restartNumberingAfterBreak="0">
+    <w:nsid w:val="7202045F"/>
+    <w:multiLevelType w:val="hybridMultilevel"/>
+    <w:tmpl w:val="B30E911E"/>
+    <w:lvl w:ilvl="0" w:tplc="340A0001">
+      <w:start w:val="1"/>
+      <w:numFmt w:val="bullet"/>
+      <w:lvlText w:val=""/>
+      <w:lvlJc w:val="left"/>
+      <w:pPr>
+        <w:ind w:left="660" w:hanging="360"/>
+      </w:pPr>
+      <w:rPr>
+        <w:rFonts w:ascii="Symbol" w:hAnsi="Symbol" w:hint="default"/>
+      </w:rPr>
+    </w:lvl>
+    <w:lvl w:ilvl="1" w:tplc="340A0003" w:tentative="1">
+      <w:start w:val="1"/>
+      <w:numFmt w:val="bullet"/>
+      <w:lvlText w:val="o"/>
+      <w:lvlJc w:val="left"/>
+      <w:pPr>
+        <w:ind w:left="1380" w:hanging="360"/>
+      </w:pPr>
+      <w:rPr>
+        <w:rFonts w:ascii="Courier New" w:hAnsi="Courier New" w:cs="Courier New" w:hint="default"/>
+      </w:rPr>
+    </w:lvl>
+    <w:lvl w:ilvl="2" w:tplc="340A0005" w:tentative="1">
+      <w:start w:val="1"/>
+      <w:numFmt w:val="bullet"/>
+      <w:lvlText w:val=""/>
+      <w:lvlJc w:val="left"/>
+      <w:pPr>
+        <w:ind w:left="2100" w:hanging="360"/>
+      </w:pPr>
+      <w:rPr>
+        <w:rFonts w:ascii="Wingdings" w:hAnsi="Wingdings" w:hint="default"/>
+      </w:rPr>
+    </w:lvl>
+    <w:lvl w:ilvl="3" w:tplc="340A0001" w:tentative="1">
+      <w:start w:val="1"/>
+      <w:numFmt w:val="bullet"/>
+      <w:lvlText w:val=""/>
+      <w:lvlJc w:val="left"/>
+      <w:pPr>
+        <w:ind w:left="2820" w:hanging="360"/>
+      </w:pPr>
+      <w:rPr>
+        <w:rFonts w:ascii="Symbol" w:hAnsi="Symbol" w:hint="default"/>
+      </w:rPr>
+    </w:lvl>
+    <w:lvl w:ilvl="4" w:tplc="340A0003" w:tentative="1">
+      <w:start w:val="1"/>
+      <w:numFmt w:val="bullet"/>
+      <w:lvlText w:val="o"/>
+      <w:lvlJc w:val="left"/>
+      <w:pPr>
+        <w:ind w:left="3540" w:hanging="360"/>
+      </w:pPr>
+      <w:rPr>
+        <w:rFonts w:ascii="Courier New" w:hAnsi="Courier New" w:cs="Courier New" w:hint="default"/>
+      </w:rPr>
+    </w:lvl>
+    <w:lvl w:ilvl="5" w:tplc="340A0005" w:tentative="1">
+      <w:start w:val="1"/>
+      <w:numFmt w:val="bullet"/>
+      <w:lvlText w:val=""/>
+      <w:lvlJc w:val="left"/>
+      <w:pPr>
+        <w:ind w:left="4260" w:hanging="360"/>
+      </w:pPr>
+      <w:rPr>
+        <w:rFonts w:ascii="Wingdings" w:hAnsi="Wingdings" w:hint="default"/>
+      </w:rPr>
+    </w:lvl>
+    <w:lvl w:ilvl="6" w:tplc="340A0001" w:tentative="1">
+      <w:start w:val="1"/>
+      <w:numFmt w:val="bullet"/>
+      <w:lvlText w:val=""/>
+      <w:lvlJc w:val="left"/>
+      <w:pPr>
+        <w:ind w:left="4980" w:hanging="360"/>
+      </w:pPr>
+      <w:rPr>
+        <w:rFonts w:ascii="Symbol" w:hAnsi="Symbol" w:hint="default"/>
+      </w:rPr>
+    </w:lvl>
+    <w:lvl w:ilvl="7" w:tplc="340A0003" w:tentative="1">
+      <w:start w:val="1"/>
+      <w:numFmt w:val="bullet"/>
+      <w:lvlText w:val="o"/>
+      <w:lvlJc w:val="left"/>
+      <w:pPr>
+        <w:ind w:left="5700" w:hanging="360"/>
+      </w:pPr>
+      <w:rPr>
+        <w:rFonts w:ascii="Courier New" w:hAnsi="Courier New" w:cs="Courier New" w:hint="default"/>
+      </w:rPr>
+    </w:lvl>
+    <w:lvl w:ilvl="8" w:tplc="340A0005" w:tentative="1">
+      <w:start w:val="1"/>
+      <w:numFmt w:val="bullet"/>
+      <w:lvlText w:val=""/>
+      <w:lvlJc w:val="left"/>
+      <w:pPr>
+        <w:ind w:left="6420" w:hanging="360"/>
+      </w:pPr>
+      <w:rPr>
+        <w:rFonts w:ascii="Wingdings" w:hAnsi="Wingdings" w:hint="default"/>
+      </w:rPr>
+    </w:lvl>
+  </w:abstractNum>
+  <w:abstractNum w:abstractNumId="22" w15:restartNumberingAfterBreak="0">
     <w:nsid w:val="7CC432B4"/>
     <w:multiLevelType w:val="multilevel"/>
     <w:tmpl w:val="E090B232"/>
@@ -18621,7 +20204,120 @@
       </w:rPr>
     </w:lvl>
   </w:abstractNum>
-  <w:abstractNum w:abstractNumId="11" w15:restartNumberingAfterBreak="0">
+  <w:abstractNum w:abstractNumId="23" w15:restartNumberingAfterBreak="0">
+    <w:nsid w:val="7D0B753D"/>
+    <w:multiLevelType w:val="hybridMultilevel"/>
+    <w:tmpl w:val="F2262EC6"/>
+    <w:lvl w:ilvl="0" w:tplc="340A0005">
+      <w:start w:val="1"/>
+      <w:numFmt w:val="bullet"/>
+      <w:lvlText w:val=""/>
+      <w:lvlJc w:val="left"/>
+      <w:pPr>
+        <w:ind w:left="660" w:hanging="360"/>
+      </w:pPr>
+      <w:rPr>
+        <w:rFonts w:ascii="Wingdings" w:hAnsi="Wingdings" w:hint="default"/>
+      </w:rPr>
+    </w:lvl>
+    <w:lvl w:ilvl="1" w:tplc="340A0003" w:tentative="1">
+      <w:start w:val="1"/>
+      <w:numFmt w:val="bullet"/>
+      <w:lvlText w:val="o"/>
+      <w:lvlJc w:val="left"/>
+      <w:pPr>
+        <w:ind w:left="1380" w:hanging="360"/>
+      </w:pPr>
+      <w:rPr>
+        <w:rFonts w:ascii="Courier New" w:hAnsi="Courier New" w:cs="Courier New" w:hint="default"/>
+      </w:rPr>
+    </w:lvl>
+    <w:lvl w:ilvl="2" w:tplc="340A0005" w:tentative="1">
+      <w:start w:val="1"/>
+      <w:numFmt w:val="bullet"/>
+      <w:lvlText w:val=""/>
+      <w:lvlJc w:val="left"/>
+      <w:pPr>
+        <w:ind w:left="2100" w:hanging="360"/>
+      </w:pPr>
+      <w:rPr>
+        <w:rFonts w:ascii="Wingdings" w:hAnsi="Wingdings" w:hint="default"/>
+      </w:rPr>
+    </w:lvl>
+    <w:lvl w:ilvl="3" w:tplc="340A0001" w:tentative="1">
+      <w:start w:val="1"/>
+      <w:numFmt w:val="bullet"/>
+      <w:lvlText w:val=""/>
+      <w:lvlJc w:val="left"/>
+      <w:pPr>
+        <w:ind w:left="2820" w:hanging="360"/>
+      </w:pPr>
+      <w:rPr>
+        <w:rFonts w:ascii="Symbol" w:hAnsi="Symbol" w:hint="default"/>
+      </w:rPr>
+    </w:lvl>
+    <w:lvl w:ilvl="4" w:tplc="340A0003" w:tentative="1">
+      <w:start w:val="1"/>
+      <w:numFmt w:val="bullet"/>
+      <w:lvlText w:val="o"/>
+      <w:lvlJc w:val="left"/>
+      <w:pPr>
+        <w:ind w:left="3540" w:hanging="360"/>
+      </w:pPr>
+      <w:rPr>
+        <w:rFonts w:ascii="Courier New" w:hAnsi="Courier New" w:cs="Courier New" w:hint="default"/>
+      </w:rPr>
+    </w:lvl>
+    <w:lvl w:ilvl="5" w:tplc="340A0005" w:tentative="1">
+      <w:start w:val="1"/>
+      <w:numFmt w:val="bullet"/>
+      <w:lvlText w:val=""/>
+      <w:lvlJc w:val="left"/>
+      <w:pPr>
+        <w:ind w:left="4260" w:hanging="360"/>
+      </w:pPr>
+      <w:rPr>
+        <w:rFonts w:ascii="Wingdings" w:hAnsi="Wingdings" w:hint="default"/>
+      </w:rPr>
+    </w:lvl>
+    <w:lvl w:ilvl="6" w:tplc="340A0001" w:tentative="1">
+      <w:start w:val="1"/>
+      <w:numFmt w:val="bullet"/>
+      <w:lvlText w:val=""/>
+      <w:lvlJc w:val="left"/>
+      <w:pPr>
+        <w:ind w:left="4980" w:hanging="360"/>
+      </w:pPr>
+      <w:rPr>
+        <w:rFonts w:ascii="Symbol" w:hAnsi="Symbol" w:hint="default"/>
+      </w:rPr>
+    </w:lvl>
+    <w:lvl w:ilvl="7" w:tplc="340A0003" w:tentative="1">
+      <w:start w:val="1"/>
+      <w:numFmt w:val="bullet"/>
+      <w:lvlText w:val="o"/>
+      <w:lvlJc w:val="left"/>
+      <w:pPr>
+        <w:ind w:left="5700" w:hanging="360"/>
+      </w:pPr>
+      <w:rPr>
+        <w:rFonts w:ascii="Courier New" w:hAnsi="Courier New" w:cs="Courier New" w:hint="default"/>
+      </w:rPr>
+    </w:lvl>
+    <w:lvl w:ilvl="8" w:tplc="340A0005" w:tentative="1">
+      <w:start w:val="1"/>
+      <w:numFmt w:val="bullet"/>
+      <w:lvlText w:val=""/>
+      <w:lvlJc w:val="left"/>
+      <w:pPr>
+        <w:ind w:left="6420" w:hanging="360"/>
+      </w:pPr>
+      <w:rPr>
+        <w:rFonts w:ascii="Wingdings" w:hAnsi="Wingdings" w:hint="default"/>
+      </w:rPr>
+    </w:lvl>
+  </w:abstractNum>
+  <w:abstractNum w:abstractNumId="24" w15:restartNumberingAfterBreak="0">
     <w:nsid w:val="7D556CF0"/>
     <w:multiLevelType w:val="multilevel"/>
     <w:tmpl w:val="EB4084C4"/>
@@ -18843,40 +20539,79 @@
     </w:lvl>
   </w:abstractNum>
   <w:num w:numId="1" w16cid:durableId="2051614204">
+    <w:abstractNumId w:val="9"/>
+  </w:num>
+  <w:num w:numId="2" w16cid:durableId="956570737">
+    <w:abstractNumId w:val="6"/>
+  </w:num>
+  <w:num w:numId="3" w16cid:durableId="442531110">
+    <w:abstractNumId w:val="22"/>
+  </w:num>
+  <w:num w:numId="4" w16cid:durableId="2130585748">
+    <w:abstractNumId w:val="10"/>
+  </w:num>
+  <w:num w:numId="5" w16cid:durableId="378017842">
+    <w:abstractNumId w:val="12"/>
+  </w:num>
+  <w:num w:numId="6" w16cid:durableId="1050693223">
+    <w:abstractNumId w:val="24"/>
+  </w:num>
+  <w:num w:numId="7" w16cid:durableId="1545557349">
+    <w:abstractNumId w:val="5"/>
+  </w:num>
+  <w:num w:numId="8" w16cid:durableId="332878419">
+    <w:abstractNumId w:val="2"/>
+  </w:num>
+  <w:num w:numId="9" w16cid:durableId="348290895">
+    <w:abstractNumId w:val="17"/>
+  </w:num>
+  <w:num w:numId="10" w16cid:durableId="354617442">
+    <w:abstractNumId w:val="13"/>
+  </w:num>
+  <w:num w:numId="11" w16cid:durableId="1575508020">
+    <w:abstractNumId w:val="11"/>
+  </w:num>
+  <w:num w:numId="12" w16cid:durableId="1638414674">
     <w:abstractNumId w:val="4"/>
   </w:num>
-  <w:num w:numId="2" w16cid:durableId="956570737">
-    <w:abstractNumId w:val="3"/>
+  <w:num w:numId="13" w16cid:durableId="1712456246">
+    <w:abstractNumId w:val="23"/>
   </w:num>
-  <w:num w:numId="3" w16cid:durableId="442531110">
-    <w:abstractNumId w:val="10"/>
+  <w:num w:numId="14" w16cid:durableId="1001272539">
+    <w:abstractNumId w:val="0"/>
   </w:num>
-  <w:num w:numId="4" w16cid:durableId="2130585748">
-    <w:abstractNumId w:val="5"/>
-  </w:num>
-  <w:num w:numId="5" w16cid:durableId="378017842">
+  <w:num w:numId="15" w16cid:durableId="1917474891">
     <w:abstractNumId w:val="7"/>
   </w:num>
-  <w:num w:numId="6" w16cid:durableId="1050693223">
-    <w:abstractNumId w:val="11"/>
-  </w:num>
-  <w:num w:numId="7" w16cid:durableId="1545557349">
-    <w:abstractNumId w:val="2"/>
-  </w:num>
-  <w:num w:numId="8" w16cid:durableId="332878419">
-    <w:abstractNumId w:val="0"/>
-  </w:num>
-  <w:num w:numId="9" w16cid:durableId="348290895">
-    <w:abstractNumId w:val="9"/>
-  </w:num>
-  <w:num w:numId="10" w16cid:durableId="354617442">
+  <w:num w:numId="16" w16cid:durableId="2081324291">
     <w:abstractNumId w:val="8"/>
   </w:num>
-  <w:num w:numId="11" w16cid:durableId="1575508020">
-    <w:abstractNumId w:val="6"/>
+  <w:num w:numId="17" w16cid:durableId="1507668881">
+    <w:abstractNumId w:val="21"/>
   </w:num>
-  <w:num w:numId="12" w16cid:durableId="1638414674">
+  <w:num w:numId="18" w16cid:durableId="139880747">
+    <w:abstractNumId w:val="18"/>
+  </w:num>
+  <w:num w:numId="19" w16cid:durableId="922641383">
+    <w:abstractNumId w:val="20"/>
+  </w:num>
+  <w:num w:numId="20" w16cid:durableId="1442917226">
+    <w:abstractNumId w:val="15"/>
+  </w:num>
+  <w:num w:numId="21" w16cid:durableId="763383248">
+    <w:abstractNumId w:val="16"/>
+  </w:num>
+  <w:num w:numId="22" w16cid:durableId="1547374752">
     <w:abstractNumId w:val="1"/>
+  </w:num>
+  <w:num w:numId="23" w16cid:durableId="1920826568">
+    <w:abstractNumId w:val="19"/>
+  </w:num>
+  <w:num w:numId="24" w16cid:durableId="994836924">
+    <w:abstractNumId w:val="14"/>
+  </w:num>
+  <w:num w:numId="25" w16cid:durableId="430708913">
+    <w:abstractNumId w:val="3"/>
   </w:num>
 </w:numbering>
 </file>
@@ -19435,6 +21170,7 @@
   <w:style w:type="character" w:default="1" w:styleId="Fuentedeprrafopredeter">
     <w:name w:val="Default Paragraph Font"/>
     <w:uiPriority w:val="1"/>
+    <w:semiHidden/>
     <w:unhideWhenUsed/>
   </w:style>
   <w:style w:type="table" w:default="1" w:styleId="Tablanormal">
@@ -19541,6 +21277,59 @@
       <w:tblStyleRowBandSize w:val="1"/>
       <w:tblStyleColBandSize w:val="1"/>
     </w:tblPr>
+  </w:style>
+  <w:style w:type="paragraph" w:styleId="Prrafodelista">
+    <w:name w:val="List Paragraph"/>
+    <w:basedOn w:val="Normal"/>
+    <w:uiPriority w:val="34"/>
+    <w:qFormat/>
+    <w:rsid w:val="009F4BD4"/>
+    <w:pPr>
+      <w:ind w:left="720"/>
+      <w:contextualSpacing/>
+    </w:pPr>
+  </w:style>
+  <w:style w:type="paragraph" w:styleId="Encabezado">
+    <w:name w:val="header"/>
+    <w:basedOn w:val="Normal"/>
+    <w:link w:val="EncabezadoCar"/>
+    <w:uiPriority w:val="99"/>
+    <w:unhideWhenUsed/>
+    <w:rsid w:val="003C6EDA"/>
+    <w:pPr>
+      <w:tabs>
+        <w:tab w:val="center" w:pos="4419"/>
+        <w:tab w:val="right" w:pos="8838"/>
+      </w:tabs>
+    </w:pPr>
+  </w:style>
+  <w:style w:type="character" w:customStyle="1" w:styleId="EncabezadoCar">
+    <w:name w:val="Encabezado Car"/>
+    <w:basedOn w:val="Fuentedeprrafopredeter"/>
+    <w:link w:val="Encabezado"/>
+    <w:uiPriority w:val="99"/>
+    <w:rsid w:val="003C6EDA"/>
+  </w:style>
+  <w:style w:type="paragraph" w:styleId="Piedepgina">
+    <w:name w:val="footer"/>
+    <w:basedOn w:val="Normal"/>
+    <w:link w:val="PiedepginaCar"/>
+    <w:uiPriority w:val="99"/>
+    <w:unhideWhenUsed/>
+    <w:rsid w:val="003C6EDA"/>
+    <w:pPr>
+      <w:tabs>
+        <w:tab w:val="center" w:pos="4419"/>
+        <w:tab w:val="right" w:pos="8838"/>
+      </w:tabs>
+    </w:pPr>
+  </w:style>
+  <w:style w:type="character" w:customStyle="1" w:styleId="PiedepginaCar">
+    <w:name w:val="Pie de página Car"/>
+    <w:basedOn w:val="Fuentedeprrafopredeter"/>
+    <w:link w:val="Piedepgina"/>
+    <w:uiPriority w:val="99"/>
+    <w:rsid w:val="003C6EDA"/>
   </w:style>
 </w:styles>
 </file>
@@ -19866,6 +21655,23 @@
 </file>
 
 <file path=customXml/item1.xml><?xml version="1.0" encoding="utf-8"?>
+<p:properties xmlns:p="http://schemas.microsoft.com/office/2006/metadata/properties" xmlns:xsi="http://www.w3.org/2001/XMLSchema-instance" xmlns:pc="http://schemas.microsoft.com/office/infopath/2007/PartnerControls">
+  <documentManagement>
+    <_activity xmlns="1263d6ba-4edf-4eab-8758-03fab1903347" xsi:nil="true"/>
+  </documentManagement>
+</p:properties>
+</file>
+
+<file path=customXml/item2.xml><?xml version="1.0" encoding="utf-8"?>
+<?mso-contentType ?>
+<FormTemplates xmlns="http://schemas.microsoft.com/sharepoint/v3/contenttype/forms">
+  <Display>DocumentLibraryForm</Display>
+  <Edit>DocumentLibraryForm</Edit>
+  <New>DocumentLibraryForm</New>
+</FormTemplates>
+</file>
+
+<file path=customXml/item3.xml><?xml version="1.0" encoding="utf-8"?>
 <ct:contentTypeSchema xmlns:ct="http://schemas.microsoft.com/office/2006/metadata/contentType" xmlns:ma="http://schemas.microsoft.com/office/2006/metadata/properties/metaAttributes" ct:_="" ma:_="" ma:contentTypeName="Documento" ma:contentTypeID="0x01010086EC0FD975435A41AF7AC8D8236C43CA" ma:contentTypeVersion="6" ma:contentTypeDescription="Crear nuevo documento." ma:contentTypeScope="" ma:versionID="9c730081fd476929ed3b97e2382d2873">
   <xsd:schema xmlns:xsd="http://www.w3.org/2001/XMLSchema" xmlns:xs="http://www.w3.org/2001/XMLSchema" xmlns:p="http://schemas.microsoft.com/office/2006/metadata/properties" xmlns:ns3="1263d6ba-4edf-4eab-8758-03fab1903347" targetNamespace="http://schemas.microsoft.com/office/2006/metadata/properties" ma:root="true" ma:fieldsID="02669b48ba196918c507e7c3f8e60117" ns3:_="">
     <xsd:import namespace="1263d6ba-4edf-4eab-8758-03fab1903347"/>
@@ -20021,24 +21827,25 @@
 </ct:contentTypeSchema>
 </file>
 
-<file path=customXml/item2.xml><?xml version="1.0" encoding="utf-8"?>
-<?mso-contentType ?>
-<FormTemplates xmlns="http://schemas.microsoft.com/sharepoint/v3/contenttype/forms">
-  <Display>DocumentLibraryForm</Display>
-  <Edit>DocumentLibraryForm</Edit>
-  <New>DocumentLibraryForm</New>
-</FormTemplates>
+<file path=customXml/itemProps1.xml><?xml version="1.0" encoding="utf-8"?>
+<ds:datastoreItem xmlns:ds="http://schemas.openxmlformats.org/officeDocument/2006/customXml" ds:itemID="{BB3F2038-C1A3-47D2-86E5-38FD315F9A65}">
+  <ds:schemaRefs>
+    <ds:schemaRef ds:uri="http://schemas.microsoft.com/office/2006/metadata/properties"/>
+    <ds:schemaRef ds:uri="http://schemas.microsoft.com/office/infopath/2007/PartnerControls"/>
+    <ds:schemaRef ds:uri="1263d6ba-4edf-4eab-8758-03fab1903347"/>
+  </ds:schemaRefs>
+</ds:datastoreItem>
 </file>
 
-<file path=customXml/item3.xml><?xml version="1.0" encoding="utf-8"?>
-<p:properties xmlns:p="http://schemas.microsoft.com/office/2006/metadata/properties" xmlns:xsi="http://www.w3.org/2001/XMLSchema-instance" xmlns:pc="http://schemas.microsoft.com/office/infopath/2007/PartnerControls">
-  <documentManagement>
-    <_activity xmlns="1263d6ba-4edf-4eab-8758-03fab1903347" xsi:nil="true"/>
-  </documentManagement>
-</p:properties>
+<file path=customXml/itemProps2.xml><?xml version="1.0" encoding="utf-8"?>
+<ds:datastoreItem xmlns:ds="http://schemas.openxmlformats.org/officeDocument/2006/customXml" ds:itemID="{760F47AF-DDF1-4117-A393-42CC5A66E12C}">
+  <ds:schemaRefs>
+    <ds:schemaRef ds:uri="http://schemas.microsoft.com/sharepoint/v3/contenttype/forms"/>
+  </ds:schemaRefs>
+</ds:datastoreItem>
 </file>
 
-<file path=customXml/itemProps1.xml><?xml version="1.0" encoding="utf-8"?>
+<file path=customXml/itemProps3.xml><?xml version="1.0" encoding="utf-8"?>
 <ds:datastoreItem xmlns:ds="http://schemas.openxmlformats.org/officeDocument/2006/customXml" ds:itemID="{7DC6BF93-178A-441F-A558-FC5ADBEBE8E4}">
   <ds:schemaRefs>
     <ds:schemaRef ds:uri="http://schemas.microsoft.com/office/2006/metadata/contentType"/>
@@ -20054,22 +21861,4 @@
     <ds:schemaRef ds:uri="http://schemas.microsoft.com/internal/obd"/>
   </ds:schemaRefs>
 </ds:datastoreItem>
-</file>
-
-<file path=customXml/itemProps2.xml><?xml version="1.0" encoding="utf-8"?>
-<ds:datastoreItem xmlns:ds="http://schemas.openxmlformats.org/officeDocument/2006/customXml" ds:itemID="{760F47AF-DDF1-4117-A393-42CC5A66E12C}">
-  <ds:schemaRefs>
-    <ds:schemaRef ds:uri="http://schemas.microsoft.com/sharepoint/v3/contenttype/forms"/>
-  </ds:schemaRefs>
-</ds:datastoreItem>
-</file>
-
-<file path=customXml/itemProps3.xml><?xml version="1.0" encoding="utf-8"?>
-<ds:datastoreItem xmlns:ds="http://schemas.openxmlformats.org/officeDocument/2006/customXml" ds:itemID="{BB3F2038-C1A3-47D2-86E5-38FD315F9A65}">
-  <ds:schemaRefs>
-    <ds:schemaRef ds:uri="http://schemas.microsoft.com/office/2006/metadata/properties"/>
-    <ds:schemaRef ds:uri="http://schemas.microsoft.com/office/infopath/2007/PartnerControls"/>
-    <ds:schemaRef ds:uri="1263d6ba-4edf-4eab-8758-03fab1903347"/>
-  </ds:schemaRefs>
-</ds:datastoreItem>
 </file>
</xml_diff>